<commit_message>
Pizza design: neutral wording for who worked out the test results
- "Marcus worked out..." changed to "The expected results were worked out by hand...", matching the rest of the team's writing and the tutor's Gold Standard
- Word copy updated; previous version kept in Drafts

Co-Authored-By: Claude Opus 5.5 <noreply@anthropic.com>
</commit_message>
<xml_diff>
--- a/02_Software_Engineering/02_Contributions/Marcus_Design/Design_Pennine_Pizza.docx
+++ b/02_Software_Engineering/02_Contributions/Marcus_Design/Design_Pennine_Pizza.docx
@@ -4962,7 +4962,7 @@
         <w:pStyle w:val="FirstParagraph"/>
       </w:pPr>
       <w:r>
-        <w:t xml:space="preserve">Marcus worked out the expected results before the build. Nah runs these tests on Sorena's Flowgorithm program and records the actual results.</w:t>
+        <w:t xml:space="preserve">The expected results were worked out by hand before the build. Nah runs these tests on Sorena's Flowgorithm program and records the actual results.</w:t>
       </w:r>
     </w:p>
     <w:tbl>
@@ -6202,7 +6202,7 @@
         <w:pStyle w:val="FirstParagraph"/>
       </w:pPr>
       <w:r>
-        <w:t xml:space="preserve">Marcus worked out the expected result for Test 2 step by step before the build. Nah compares the program's answer against it.</w:t>
+        <w:t xml:space="preserve">The expected result for Test 2 was worked out by hand before the build. Nah compares the program's answer against it.</w:t>
       </w:r>
     </w:p>
     <w:tbl>

</xml_diff>

<commit_message>
Pizza design: add drawings, write out getCustomerDetails and checkBlank steps
- Structure chart and Main flowchart added as Figure 1 and 2, plus the draw.io file
- getCustomerDetails and checkBlank pseudocode written out (as in the Supercar example)
- label array and details variable added to the data plan
- Word copy updated to match; drafts v5 to v7 kept as evidence

Co-Authored-By: Claude Opus 5.5 <noreply@anthropic.com>
</commit_message>
<xml_diff>
--- a/02_Software_Engineering/02_Contributions/Marcus_Design/Design_Pennine_Pizza.docx
+++ b/02_Software_Engineering/02_Contributions/Marcus_Design/Design_Pennine_Pizza.docx
@@ -2,7 +2,7 @@
 <file path=word/document.xml><?xml version="1.0" encoding="utf-8"?>
 <w:document xmlns:w="http://schemas.openxmlformats.org/wordprocessingml/2006/main" xmlns:m="http://schemas.openxmlformats.org/officeDocument/2006/math" xmlns:r="http://schemas.openxmlformats.org/officeDocument/2006/relationships" xmlns:o="urn:schemas-microsoft-com:office:office" xmlns:v="urn:schemas-microsoft-com:vml" xmlns:w10="urn:schemas-microsoft-com:office:word" xmlns:a="http://schemas.openxmlformats.org/drawingml/2006/main" xmlns:pic="http://schemas.openxmlformats.org/drawingml/2006/picture" xmlns:wp="http://schemas.openxmlformats.org/drawingml/2006/wordprocessingDrawing">
   <w:body>
-    <w:bookmarkStart w:id="32" w:name="pennine-pizza-works-design"/>
+    <w:bookmarkStart w:id="38" w:name="pennine-pizza-works-design"/>
     <w:p>
       <w:pPr>
         <w:pStyle w:val="Heading1"/>
@@ -74,7 +74,7 @@
         <w:t xml:space="preserve"> </w:t>
       </w:r>
       <w:r>
-        <w:t xml:space="preserve">Charlie's Analysis (requirements table and IPO table)</w:t>
+        <w:t xml:space="preserve">Charlie’s Analysis (requirements table and IPO table)</w:t>
       </w:r>
     </w:p>
     <w:p>
@@ -92,7 +92,7 @@
         <w:t xml:space="preserve"> </w:t>
       </w:r>
       <w:r>
-        <w:t xml:space="preserve">the tutor's worked example,</w:t>
+        <w:t xml:space="preserve">the tutor’s worked example,</w:t>
       </w:r>
       <w:r>
         <w:t xml:space="preserve"> </w:t>
@@ -129,7 +129,7 @@
         <w:pStyle w:val="FirstParagraph"/>
       </w:pPr>
       <w:r>
-        <w:t xml:space="preserve">These are Charlie's requirements from the Analysis stage, copied as written, so every part of the design traces back to the same numbers.</w:t>
+        <w:t xml:space="preserve">These are Charlie’s requirements from the Analysis stage, copied as written, so every part of the design traces back to the same numbers.</w:t>
       </w:r>
     </w:p>
     <w:tbl>
@@ -1214,7 +1214,7 @@
       </w:r>
     </w:p>
     <w:bookmarkEnd w:id="9"/>
-    <w:bookmarkStart w:id="10" w:name="X1a902bf427003d794f5f7f89542a7ae5332519f"/>
+    <w:bookmarkStart w:id="13" w:name="X1a902bf427003d794f5f7f89542a7ae5332519f"/>
     <w:p>
       <w:pPr>
         <w:pStyle w:val="Heading2"/>
@@ -1346,15 +1346,62 @@
         <w:pStyle w:val="FirstParagraph"/>
       </w:pPr>
       <w:r>
+        <w:drawing>
+          <wp:inline>
+            <wp:extent cx="5334000" cy="2256692"/>
+            <wp:effectExtent b="0" l="0" r="0" t="0"/>
+            <wp:docPr descr="Figure 1: Structure chart" title="" id="11" name="Picture"/>
+            <a:graphic>
+              <a:graphicData uri="http://schemas.openxmlformats.org/drawingml/2006/picture">
+                <pic:pic>
+                  <pic:nvPicPr>
+                    <pic:cNvPr descr="Structure_chart.png" id="12" name="Picture"/>
+                    <pic:cNvPicPr>
+                      <a:picLocks noChangeArrowheads="1" noChangeAspect="1"/>
+                    </pic:cNvPicPr>
+                  </pic:nvPicPr>
+                  <pic:blipFill>
+                    <a:blip r:embed="rId10"/>
+                    <a:stretch>
+                      <a:fillRect/>
+                    </a:stretch>
+                  </pic:blipFill>
+                  <pic:spPr bwMode="auto">
+                    <a:xfrm>
+                      <a:off x="0" y="0"/>
+                      <a:ext cx="5334000" cy="2256692"/>
+                    </a:xfrm>
+                    <a:prstGeom prst="rect">
+                      <a:avLst/>
+                    </a:prstGeom>
+                    <a:noFill/>
+                    <a:ln w="9525">
+                      <a:noFill/>
+                      <a:headEnd/>
+                      <a:tailEnd/>
+                    </a:ln>
+                  </pic:spPr>
+                </pic:pic>
+              </a:graphicData>
+            </a:graphic>
+          </wp:inline>
+        </w:drawing>
+      </w:r>
+    </w:p>
+    <w:p>
+      <w:pPr>
+        <w:pStyle w:val="BodyText"/>
+      </w:pPr>
+      <w:r>
         <w:rPr>
           <w:i/>
           <w:iCs/>
         </w:rPr>
-        <w:t xml:space="preserve">To draw in draw.io (page 2 of PenninePizzaDesign.drawio).</w:t>
+        <w:t xml:space="preserve">Figure 1: Structure chart (drawn from page 2 of PenninePizzaDesign.drawio)</w:t>
       </w:r>
     </w:p>
-    <w:bookmarkEnd w:id="10"/>
-    <w:bookmarkStart w:id="11" w:name="Xf405159cf99348bd0581706131149699214828c"/>
+    <w:bookmarkEnd w:id="13"/>
+    <w:bookmarkStart w:id="17" w:name="Xf405159cf99348bd0581706131149699214828c"/>
     <w:p>
       <w:pPr>
         <w:pStyle w:val="Heading2"/>
@@ -1716,15 +1763,62 @@
         <w:pStyle w:val="BodyText"/>
       </w:pPr>
       <w:r>
+        <w:drawing>
+          <wp:inline>
+            <wp:extent cx="5334000" cy="5773270"/>
+            <wp:effectExtent b="0" l="0" r="0" t="0"/>
+            <wp:docPr descr="Figure 2: Main flowchart design" title="" id="15" name="Picture"/>
+            <a:graphic>
+              <a:graphicData uri="http://schemas.openxmlformats.org/drawingml/2006/picture">
+                <pic:pic>
+                  <pic:nvPicPr>
+                    <pic:cNvPr descr="Main_flowchart.png" id="16" name="Picture"/>
+                    <pic:cNvPicPr>
+                      <a:picLocks noChangeArrowheads="1" noChangeAspect="1"/>
+                    </pic:cNvPicPr>
+                  </pic:nvPicPr>
+                  <pic:blipFill>
+                    <a:blip r:embed="rId14"/>
+                    <a:stretch>
+                      <a:fillRect/>
+                    </a:stretch>
+                  </pic:blipFill>
+                  <pic:spPr bwMode="auto">
+                    <a:xfrm>
+                      <a:off x="0" y="0"/>
+                      <a:ext cx="5334000" cy="5773270"/>
+                    </a:xfrm>
+                    <a:prstGeom prst="rect">
+                      <a:avLst/>
+                    </a:prstGeom>
+                    <a:noFill/>
+                    <a:ln w="9525">
+                      <a:noFill/>
+                      <a:headEnd/>
+                      <a:tailEnd/>
+                    </a:ln>
+                  </pic:spPr>
+                </pic:pic>
+              </a:graphicData>
+            </a:graphic>
+          </wp:inline>
+        </w:drawing>
+      </w:r>
+    </w:p>
+    <w:p>
+      <w:pPr>
+        <w:pStyle w:val="BodyText"/>
+      </w:pPr>
+      <w:r>
         <w:rPr>
           <w:i/>
           <w:iCs/>
         </w:rPr>
-        <w:t xml:space="preserve">To draw in draw.io (page 1 of PenninePizzaDesign.drawio).</w:t>
+        <w:t xml:space="preserve">Figure 2: Main flowchart design (drawn from page 1 of PenninePizzaDesign.drawio)</w:t>
       </w:r>
     </w:p>
-    <w:bookmarkEnd w:id="11"/>
-    <w:bookmarkStart w:id="14" w:name="Xc6f0f334f8618891d3a393afd742b7bb88c8861"/>
+    <w:bookmarkEnd w:id="17"/>
+    <w:bookmarkStart w:id="20" w:name="Xc6f0f334f8618891d3a393afd742b7bb88c8861"/>
     <w:p>
       <w:pPr>
         <w:pStyle w:val="Heading2"/>
@@ -1733,7 +1827,7 @@
         <w:t xml:space="preserve">2.3 Data plan</w:t>
       </w:r>
     </w:p>
-    <w:bookmarkStart w:id="12" w:name="data-structures-arrays"/>
+    <w:bookmarkStart w:id="18" w:name="data-structures-arrays"/>
     <w:p>
       <w:pPr>
         <w:pStyle w:val="Heading3"/>
@@ -1747,7 +1841,7 @@
         <w:pStyle w:val="FirstParagraph"/>
       </w:pPr>
       <w:r>
-        <w:t xml:space="preserve">Main declares every array. Flowgorithm passes arrays by reference, so a subroutine can fill an array that Main owns.</w:t>
+        <w:t xml:space="preserve">Main declares every array the subroutines share. Flowgorithm passes arrays by reference, so a subroutine can fill an array that Main owns.</w:t>
       </w:r>
     </w:p>
     <w:tbl>
@@ -1769,8 +1863,8 @@
         <w:gridCol w:w="2200"/>
         <w:gridCol w:w="1160"/>
         <w:gridCol w:w="770"/>
-        <w:gridCol w:w="2622"/>
-        <w:gridCol w:w="2607"/>
+        <w:gridCol w:w="2640"/>
+        <w:gridCol w:w="2590"/>
       </w:tblGrid>
       <w:tr>
         <w:trPr>
@@ -1884,7 +1978,13 @@
               <w:pStyle w:val="Compact"/>
             </w:pPr>
             <w:r>
-              <w:t xml:space="preserve">customerDetails[0] = "Sam Patel"</w:t>
+              <w:t xml:space="preserve">customerDetails[0] =</w:t>
+            </w:r>
+            <w:r>
+              <w:t xml:space="preserve"> </w:t>
+            </w:r>
+            <w:r>
+              <w:t xml:space="preserve">“Sam Patel”</w:t>
             </w:r>
           </w:p>
         </w:tc>
@@ -1941,7 +2041,13 @@
               <w:pStyle w:val="Compact"/>
             </w:pPr>
             <w:r>
-              <w:t xml:space="preserve">sizeNames[2] = "Large"</w:t>
+              <w:t xml:space="preserve">sizeNames[2] =</w:t>
+            </w:r>
+            <w:r>
+              <w:t xml:space="preserve"> </w:t>
+            </w:r>
+            <w:r>
+              <w:t xml:space="preserve">“Large”</w:t>
             </w:r>
           </w:p>
         </w:tc>
@@ -2227,6 +2333,63 @@
             </w:pPr>
             <w:r>
               <w:t xml:space="preserve">totals[3] = 19.00</w:t>
+            </w:r>
+          </w:p>
+        </w:tc>
+      </w:tr>
+      <w:tr>
+        <w:tc>
+          <w:tcPr/>
+          <w:p>
+            <w:pPr>
+              <w:pStyle w:val="Compact"/>
+            </w:pPr>
+            <w:r>
+              <w:t xml:space="preserve">label</w:t>
+            </w:r>
+          </w:p>
+        </w:tc>
+        <w:tc>
+          <w:tcPr/>
+          <w:p>
+            <w:pPr>
+              <w:pStyle w:val="Compact"/>
+            </w:pPr>
+            <w:r>
+              <w:t xml:space="preserve">String</w:t>
+            </w:r>
+          </w:p>
+        </w:tc>
+        <w:tc>
+          <w:tcPr/>
+          <w:p>
+            <w:pPr>
+              <w:pStyle w:val="Compact"/>
+            </w:pPr>
+            <w:r>
+              <w:t xml:space="preserve">3</w:t>
+            </w:r>
+          </w:p>
+        </w:tc>
+        <w:tc>
+          <w:tcPr/>
+          <w:p>
+            <w:pPr>
+              <w:pStyle w:val="Compact"/>
+            </w:pPr>
+            <w:r>
+              <w:t xml:space="preserve">The word used in each prompt: “Name”, “Address”, “PhoneNo”. Declared in getCustomerDetails, not Main.</w:t>
+            </w:r>
+          </w:p>
+        </w:tc>
+        <w:tc>
+          <w:tcPr/>
+          <w:p>
+            <w:pPr>
+              <w:pStyle w:val="Compact"/>
+            </w:pPr>
+            <w:r>
+              <w:t xml:space="preserve">label[1] = “Address”</w:t>
             </w:r>
           </w:p>
         </w:tc>
@@ -2263,8 +2426,8 @@
         <w:t xml:space="preserve">toppingPrice uses the number of toppings as the index. Any number of 4 or more uses index 4, because the brief charges the same £2.50 for 4 or more.</w:t>
       </w:r>
     </w:p>
-    <w:bookmarkEnd w:id="12"/>
-    <w:bookmarkStart w:id="13" w:name="variables"/>
+    <w:bookmarkEnd w:id="18"/>
+    <w:bookmarkStart w:id="19" w:name="variables"/>
     <w:p>
       <w:pPr>
         <w:pStyle w:val="Heading3"/>
@@ -2292,8 +2455,8 @@
         <w:gridCol w:w="1550"/>
         <w:gridCol w:w="1160"/>
         <w:gridCol w:w="2070"/>
-        <w:gridCol w:w="2640"/>
-        <w:gridCol w:w="1940"/>
+        <w:gridCol w:w="3030"/>
+        <w:gridCol w:w="1550"/>
       </w:tblGrid>
       <w:tr>
         <w:trPr>
@@ -2464,7 +2627,19 @@
               <w:pStyle w:val="Compact"/>
             </w:pPr>
             <w:r>
-              <w:t xml:space="preserve">"Y" or "N"</w:t>
+              <w:t xml:space="preserve">“Y”</w:t>
+            </w:r>
+            <w:r>
+              <w:t xml:space="preserve"> </w:t>
+            </w:r>
+            <w:r>
+              <w:t xml:space="preserve">or</w:t>
+            </w:r>
+            <w:r>
+              <w:t xml:space="preserve"> </w:t>
+            </w:r>
+            <w:r>
+              <w:t xml:space="preserve">“N”</w:t>
             </w:r>
           </w:p>
         </w:tc>
@@ -2697,10 +2872,67 @@
           </w:p>
         </w:tc>
       </w:tr>
+      <w:tr>
+        <w:tc>
+          <w:tcPr/>
+          <w:p>
+            <w:pPr>
+              <w:pStyle w:val="Compact"/>
+            </w:pPr>
+            <w:r>
+              <w:t xml:space="preserve">details</w:t>
+            </w:r>
+          </w:p>
+        </w:tc>
+        <w:tc>
+          <w:tcPr/>
+          <w:p>
+            <w:pPr>
+              <w:pStyle w:val="Compact"/>
+            </w:pPr>
+            <w:r>
+              <w:t xml:space="preserve">String</w:t>
+            </w:r>
+          </w:p>
+        </w:tc>
+        <w:tc>
+          <w:tcPr/>
+          <w:p>
+            <w:pPr>
+              <w:pStyle w:val="Compact"/>
+            </w:pPr>
+            <w:r>
+              <w:t xml:space="preserve">checkBlank (parameter and return value)</w:t>
+            </w:r>
+          </w:p>
+        </w:tc>
+        <w:tc>
+          <w:tcPr/>
+          <w:p>
+            <w:pPr>
+              <w:pStyle w:val="Compact"/>
+            </w:pPr>
+            <w:r>
+              <w:t xml:space="preserve">The customer detail being checked</w:t>
+            </w:r>
+          </w:p>
+        </w:tc>
+        <w:tc>
+          <w:tcPr/>
+          <w:p>
+            <w:pPr>
+              <w:pStyle w:val="Compact"/>
+            </w:pPr>
+            <w:r>
+              <w:t xml:space="preserve">Must not be blank</w:t>
+            </w:r>
+          </w:p>
+        </w:tc>
+      </w:tr>
     </w:tbl>
-    <w:bookmarkEnd w:id="13"/>
-    <w:bookmarkEnd w:id="14"/>
-    <w:bookmarkStart w:id="15" w:name="Xa5de0fe7fcc46c4a34ab72b0aff7edb614b8ef4"/>
+    <w:bookmarkEnd w:id="19"/>
+    <w:bookmarkEnd w:id="20"/>
+    <w:bookmarkStart w:id="21" w:name="Xa5de0fe7fcc46c4a34ab72b0aff7edb614b8ef4"/>
     <w:p>
       <w:pPr>
         <w:pStyle w:val="Heading2"/>
@@ -3004,7 +3236,7 @@
               <w:pStyle w:val="Compact"/>
             </w:pPr>
             <w:r>
-              <w:t xml:space="preserve">Stores the client's price list (R9 to R15).</w:t>
+              <w:t xml:space="preserve">Stores the client’s price list (R9 to R15).</w:t>
             </w:r>
           </w:p>
         </w:tc>
@@ -3286,8 +3518,8 @@
         </w:tc>
       </w:tr>
     </w:tbl>
-    <w:bookmarkEnd w:id="15"/>
-    <w:bookmarkStart w:id="27" w:name="X2645ca7fbf209bdb05f7608772ab1443a8d7ad0"/>
+    <w:bookmarkEnd w:id="21"/>
+    <w:bookmarkStart w:id="33" w:name="X2645ca7fbf209bdb05f7608772ab1443a8d7ad0"/>
     <w:p>
       <w:pPr>
         <w:pStyle w:val="Heading2"/>
@@ -3296,7 +3528,7 @@
         <w:t xml:space="preserve">2.5 Algorithm: pseudocode</w:t>
       </w:r>
     </w:p>
-    <w:bookmarkStart w:id="16" w:name="main"/>
+    <w:bookmarkStart w:id="22" w:name="main"/>
     <w:p>
       <w:pPr>
         <w:pStyle w:val="Heading3"/>
@@ -3526,32 +3758,14 @@
         <w:t xml:space="preserve">END SUBROUTINE</w:t>
       </w:r>
     </w:p>
-    <w:bookmarkEnd w:id="16"/>
-    <w:bookmarkStart w:id="17" w:name="getcustomerdetails-and-checkblank"/>
+    <w:bookmarkEnd w:id="22"/>
+    <w:bookmarkStart w:id="23" w:name="getcustomerdetails-and-checkblank"/>
     <w:p>
       <w:pPr>
         <w:pStyle w:val="Heading3"/>
       </w:pPr>
       <w:r>
         <w:t xml:space="preserve">getCustomerDetails and checkBlank</w:t>
-      </w:r>
-    </w:p>
-    <w:p>
-      <w:pPr>
-        <w:pStyle w:val="FirstParagraph"/>
-      </w:pPr>
-      <w:r>
-        <w:t xml:space="preserve">The same as the Supercar solution: a For loop uses a label array ("Name", "Address", "PhoneNo") to ask for each detail, and checkBlank asks again while the entry is blank.</w:t>
-      </w:r>
-    </w:p>
-    <w:bookmarkEnd w:id="17"/>
-    <w:bookmarkStart w:id="18" w:name="getpizzas"/>
-    <w:p>
-      <w:pPr>
-        <w:pStyle w:val="Heading3"/>
-      </w:pPr>
-      <w:r>
-        <w:t xml:space="preserve">getPizzas</w:t>
       </w:r>
     </w:p>
     <w:p>
@@ -3562,88 +3776,181 @@
         <w:rPr>
           <w:rStyle w:val="VerbatimChar"/>
         </w:rPr>
-        <w:t xml:space="preserve">FUNCTION getPizzas() RETURNS Integer noOfPizzas</w:t>
-      </w:r>
-      <w:r>
-        <w:br/>
-      </w:r>
-      <w:r>
-        <w:rPr>
-          <w:rStyle w:val="VerbatimChar"/>
-        </w:rPr>
-        <w:t xml:space="preserve">    DECLARE Integer noOfPizzas</w:t>
-      </w:r>
-      <w:r>
-        <w:br/>
-      </w:r>
-      <w:r>
-        <w:rPr>
-          <w:rStyle w:val="VerbatimChar"/>
-        </w:rPr>
-        <w:t xml:space="preserve">    DO</w:t>
-      </w:r>
-      <w:r>
-        <w:br/>
-      </w:r>
-      <w:r>
-        <w:rPr>
-          <w:rStyle w:val="VerbatimChar"/>
-        </w:rPr>
-        <w:t xml:space="preserve">        OUTPUT "Enter number of pizzas (1-6):"</w:t>
-      </w:r>
-      <w:r>
-        <w:br/>
-      </w:r>
-      <w:r>
-        <w:rPr>
-          <w:rStyle w:val="VerbatimChar"/>
-        </w:rPr>
-        <w:t xml:space="preserve">        INPUT noOfPizzas</w:t>
-      </w:r>
-      <w:r>
-        <w:br/>
-      </w:r>
-      <w:r>
-        <w:rPr>
-          <w:rStyle w:val="VerbatimChar"/>
-        </w:rPr>
-        <w:t xml:space="preserve">        IF noOfPizzas &lt; 1 OR noOfPizzas &gt; 6 THEN</w:t>
-      </w:r>
-      <w:r>
-        <w:br/>
-      </w:r>
-      <w:r>
-        <w:rPr>
-          <w:rStyle w:val="VerbatimChar"/>
-        </w:rPr>
-        <w:t xml:space="preserve">            OUTPUT "Error, must be between 1 and 6!"</w:t>
-      </w:r>
-      <w:r>
-        <w:br/>
-      </w:r>
-      <w:r>
-        <w:rPr>
-          <w:rStyle w:val="VerbatimChar"/>
-        </w:rPr>
-        <w:t xml:space="preserve">        END IF</w:t>
-      </w:r>
-      <w:r>
-        <w:br/>
-      </w:r>
-      <w:r>
-        <w:rPr>
-          <w:rStyle w:val="VerbatimChar"/>
-        </w:rPr>
-        <w:t xml:space="preserve">    WHILE noOfPizzas &lt; 1 OR noOfPizzas &gt; 6</w:t>
-      </w:r>
-      <w:r>
-        <w:br/>
-      </w:r>
-      <w:r>
-        <w:rPr>
-          <w:rStyle w:val="VerbatimChar"/>
-        </w:rPr>
-        <w:t xml:space="preserve">    RETURN noOfPizzas</w:t>
+        <w:t xml:space="preserve">SUBROUTINE getCustomerDetails(customerDetails[])</w:t>
+      </w:r>
+      <w:r>
+        <w:br/>
+      </w:r>
+      <w:r>
+        <w:rPr>
+          <w:rStyle w:val="VerbatimChar"/>
+        </w:rPr>
+        <w:t xml:space="preserve">    DECLARE String label[3]</w:t>
+      </w:r>
+      <w:r>
+        <w:br/>
+      </w:r>
+      <w:r>
+        <w:rPr>
+          <w:rStyle w:val="VerbatimChar"/>
+        </w:rPr>
+        <w:t xml:space="preserve">    label[0] = "Name"</w:t>
+      </w:r>
+      <w:r>
+        <w:br/>
+      </w:r>
+      <w:r>
+        <w:rPr>
+          <w:rStyle w:val="VerbatimChar"/>
+        </w:rPr>
+        <w:t xml:space="preserve">    label[1] = "Address"</w:t>
+      </w:r>
+      <w:r>
+        <w:br/>
+      </w:r>
+      <w:r>
+        <w:rPr>
+          <w:rStyle w:val="VerbatimChar"/>
+        </w:rPr>
+        <w:t xml:space="preserve">    label[2] = "PhoneNo"</w:t>
+      </w:r>
+      <w:r>
+        <w:br/>
+      </w:r>
+      <w:r>
+        <w:rPr>
+          <w:rStyle w:val="VerbatimChar"/>
+        </w:rPr>
+        <w:t xml:space="preserve">    DECLARE Integer loop</w:t>
+      </w:r>
+      <w:r>
+        <w:br/>
+      </w:r>
+      <w:r>
+        <w:rPr>
+          <w:rStyle w:val="VerbatimChar"/>
+        </w:rPr>
+        <w:t xml:space="preserve">    FOR loop = 0 TO 2</w:t>
+      </w:r>
+      <w:r>
+        <w:br/>
+      </w:r>
+      <w:r>
+        <w:rPr>
+          <w:rStyle w:val="VerbatimChar"/>
+        </w:rPr>
+        <w:t xml:space="preserve">        OUTPUT "Enter " &amp; label[loop] &amp; " :"</w:t>
+      </w:r>
+      <w:r>
+        <w:br/>
+      </w:r>
+      <w:r>
+        <w:rPr>
+          <w:rStyle w:val="VerbatimChar"/>
+        </w:rPr>
+        <w:t xml:space="preserve">        INPUT customerDetails[loop]</w:t>
+      </w:r>
+      <w:r>
+        <w:br/>
+      </w:r>
+      <w:r>
+        <w:rPr>
+          <w:rStyle w:val="VerbatimChar"/>
+        </w:rPr>
+        <w:t xml:space="preserve">        // Make sure the entry is not blank</w:t>
+      </w:r>
+      <w:r>
+        <w:br/>
+      </w:r>
+      <w:r>
+        <w:rPr>
+          <w:rStyle w:val="VerbatimChar"/>
+        </w:rPr>
+        <w:t xml:space="preserve">        customerDetails[loop] = checkBlank(customerDetails[loop])</w:t>
+      </w:r>
+      <w:r>
+        <w:br/>
+      </w:r>
+      <w:r>
+        <w:rPr>
+          <w:rStyle w:val="VerbatimChar"/>
+        </w:rPr>
+        <w:t xml:space="preserve">    NEXT loop</w:t>
+      </w:r>
+      <w:r>
+        <w:br/>
+      </w:r>
+      <w:r>
+        <w:rPr>
+          <w:rStyle w:val="VerbatimChar"/>
+        </w:rPr>
+        <w:t xml:space="preserve">END SUBROUTINE</w:t>
+      </w:r>
+      <w:r>
+        <w:br/>
+      </w:r>
+      <w:r>
+        <w:br/>
+      </w:r>
+      <w:r>
+        <w:rPr>
+          <w:rStyle w:val="VerbatimChar"/>
+        </w:rPr>
+        <w:t xml:space="preserve">FUNCTION checkBlank(details) RETURNS String details</w:t>
+      </w:r>
+      <w:r>
+        <w:br/>
+      </w:r>
+      <w:r>
+        <w:rPr>
+          <w:rStyle w:val="VerbatimChar"/>
+        </w:rPr>
+        <w:t xml:space="preserve">    // Ask again while the entry is blank</w:t>
+      </w:r>
+      <w:r>
+        <w:br/>
+      </w:r>
+      <w:r>
+        <w:rPr>
+          <w:rStyle w:val="VerbatimChar"/>
+        </w:rPr>
+        <w:t xml:space="preserve">    WHILE ToCode(Char(details &amp; " ",0)) = 32</w:t>
+      </w:r>
+      <w:r>
+        <w:br/>
+      </w:r>
+      <w:r>
+        <w:rPr>
+          <w:rStyle w:val="VerbatimChar"/>
+        </w:rPr>
+        <w:t xml:space="preserve">        OUTPUT "This cannot be blank, try again!"</w:t>
+      </w:r>
+      <w:r>
+        <w:br/>
+      </w:r>
+      <w:r>
+        <w:rPr>
+          <w:rStyle w:val="VerbatimChar"/>
+        </w:rPr>
+        <w:t xml:space="preserve">        INPUT details</w:t>
+      </w:r>
+      <w:r>
+        <w:br/>
+      </w:r>
+      <w:r>
+        <w:rPr>
+          <w:rStyle w:val="VerbatimChar"/>
+        </w:rPr>
+        <w:t xml:space="preserve">    END WHILE</w:t>
+      </w:r>
+      <w:r>
+        <w:br/>
+      </w:r>
+      <w:r>
+        <w:rPr>
+          <w:rStyle w:val="VerbatimChar"/>
+        </w:rPr>
+        <w:t xml:space="preserve">    RETURN details</w:t>
       </w:r>
       <w:r>
         <w:br/>
@@ -3655,14 +3962,14 @@
         <w:t xml:space="preserve">END FUNCTION</w:t>
       </w:r>
     </w:p>
-    <w:bookmarkEnd w:id="18"/>
-    <w:bookmarkStart w:id="19" w:name="choosepizzas"/>
+    <w:bookmarkEnd w:id="23"/>
+    <w:bookmarkStart w:id="24" w:name="getpizzas"/>
     <w:p>
       <w:pPr>
         <w:pStyle w:val="Heading3"/>
       </w:pPr>
       <w:r>
-        <w:t xml:space="preserve">choosePizzas</w:t>
+        <w:t xml:space="preserve">getPizzas</w:t>
       </w:r>
     </w:p>
     <w:p>
@@ -3673,34 +3980,16 @@
         <w:rPr>
           <w:rStyle w:val="VerbatimChar"/>
         </w:rPr>
-        <w:t xml:space="preserve">SUBROUTINE choosePizzas(sizeNames[], sizePrice[], toppingPrice[], noOfPizzas, chosenSize[], chosenToppings[])</w:t>
-      </w:r>
-      <w:r>
-        <w:br/>
-      </w:r>
-      <w:r>
-        <w:rPr>
-          <w:rStyle w:val="VerbatimChar"/>
-        </w:rPr>
-        <w:t xml:space="preserve">    DECLARE Integer counter</w:t>
-      </w:r>
-      <w:r>
-        <w:br/>
-      </w:r>
-      <w:r>
-        <w:rPr>
-          <w:rStyle w:val="VerbatimChar"/>
-        </w:rPr>
-        <w:t xml:space="preserve">    counter = 0</w:t>
-      </w:r>
-      <w:r>
-        <w:br/>
-      </w:r>
-      <w:r>
-        <w:rPr>
-          <w:rStyle w:val="VerbatimChar"/>
-        </w:rPr>
-        <w:t xml:space="preserve">    CALL populateMenu(sizeNames, sizePrice, toppingPrice)</w:t>
+        <w:t xml:space="preserve">FUNCTION getPizzas() RETURNS Integer noOfPizzas</w:t>
+      </w:r>
+      <w:r>
+        <w:br/>
+      </w:r>
+      <w:r>
+        <w:rPr>
+          <w:rStyle w:val="VerbatimChar"/>
+        </w:rPr>
+        <w:t xml:space="preserve">    DECLARE Integer noOfPizzas</w:t>
       </w:r>
       <w:r>
         <w:br/>
@@ -3718,62 +4007,80 @@
         <w:rPr>
           <w:rStyle w:val="VerbatimChar"/>
         </w:rPr>
-        <w:t xml:space="preserve">        CALL displayMenu(sizeNames, sizePrice)</w:t>
-      </w:r>
-      <w:r>
-        <w:br/>
-      </w:r>
-      <w:r>
-        <w:rPr>
-          <w:rStyle w:val="VerbatimChar"/>
-        </w:rPr>
-        <w:t xml:space="preserve">        CALL makeSizeChoice(chosenSize, counter)</w:t>
-      </w:r>
-      <w:r>
-        <w:br/>
-      </w:r>
-      <w:r>
-        <w:rPr>
-          <w:rStyle w:val="VerbatimChar"/>
-        </w:rPr>
-        <w:t xml:space="preserve">        CALL getToppings(chosenToppings, counter)</w:t>
-      </w:r>
-      <w:r>
-        <w:br/>
-      </w:r>
-      <w:r>
-        <w:rPr>
-          <w:rStyle w:val="VerbatimChar"/>
-        </w:rPr>
-        <w:t xml:space="preserve">        counter = counter + 1</w:t>
-      </w:r>
-      <w:r>
-        <w:br/>
-      </w:r>
-      <w:r>
-        <w:rPr>
-          <w:rStyle w:val="VerbatimChar"/>
-        </w:rPr>
-        <w:t xml:space="preserve">    WHILE counter &lt; noOfPizzas</w:t>
-      </w:r>
-      <w:r>
-        <w:br/>
-      </w:r>
-      <w:r>
-        <w:rPr>
-          <w:rStyle w:val="VerbatimChar"/>
-        </w:rPr>
-        <w:t xml:space="preserve">END SUBROUTINE</w:t>
+        <w:t xml:space="preserve">        OUTPUT "Enter number of pizzas (1-6):"</w:t>
+      </w:r>
+      <w:r>
+        <w:br/>
+      </w:r>
+      <w:r>
+        <w:rPr>
+          <w:rStyle w:val="VerbatimChar"/>
+        </w:rPr>
+        <w:t xml:space="preserve">        INPUT noOfPizzas</w:t>
+      </w:r>
+      <w:r>
+        <w:br/>
+      </w:r>
+      <w:r>
+        <w:rPr>
+          <w:rStyle w:val="VerbatimChar"/>
+        </w:rPr>
+        <w:t xml:space="preserve">        IF noOfPizzas &lt; 1 OR noOfPizzas &gt; 6 THEN</w:t>
+      </w:r>
+      <w:r>
+        <w:br/>
+      </w:r>
+      <w:r>
+        <w:rPr>
+          <w:rStyle w:val="VerbatimChar"/>
+        </w:rPr>
+        <w:t xml:space="preserve">            OUTPUT "Error, must be between 1 and 6!"</w:t>
+      </w:r>
+      <w:r>
+        <w:br/>
+      </w:r>
+      <w:r>
+        <w:rPr>
+          <w:rStyle w:val="VerbatimChar"/>
+        </w:rPr>
+        <w:t xml:space="preserve">        END IF</w:t>
+      </w:r>
+      <w:r>
+        <w:br/>
+      </w:r>
+      <w:r>
+        <w:rPr>
+          <w:rStyle w:val="VerbatimChar"/>
+        </w:rPr>
+        <w:t xml:space="preserve">    WHILE noOfPizzas &lt; 1 OR noOfPizzas &gt; 6</w:t>
+      </w:r>
+      <w:r>
+        <w:br/>
+      </w:r>
+      <w:r>
+        <w:rPr>
+          <w:rStyle w:val="VerbatimChar"/>
+        </w:rPr>
+        <w:t xml:space="preserve">    RETURN noOfPizzas</w:t>
+      </w:r>
+      <w:r>
+        <w:br/>
+      </w:r>
+      <w:r>
+        <w:rPr>
+          <w:rStyle w:val="VerbatimChar"/>
+        </w:rPr>
+        <w:t xml:space="preserve">END FUNCTION</w:t>
       </w:r>
     </w:p>
-    <w:bookmarkEnd w:id="19"/>
-    <w:bookmarkStart w:id="20" w:name="populatemenu"/>
+    <w:bookmarkEnd w:id="24"/>
+    <w:bookmarkStart w:id="25" w:name="choosepizzas"/>
     <w:p>
       <w:pPr>
         <w:pStyle w:val="Heading3"/>
       </w:pPr>
       <w:r>
-        <w:t xml:space="preserve">populateMenu</w:t>
+        <w:t xml:space="preserve">choosePizzas</w:t>
       </w:r>
     </w:p>
     <w:p>
@@ -3784,79 +4091,88 @@
         <w:rPr>
           <w:rStyle w:val="VerbatimChar"/>
         </w:rPr>
-        <w:t xml:space="preserve">SUBROUTINE populateMenu(sizeNames[], sizePrice[], toppingPrice[])</w:t>
-      </w:r>
-      <w:r>
-        <w:br/>
-      </w:r>
-      <w:r>
-        <w:rPr>
-          <w:rStyle w:val="VerbatimChar"/>
-        </w:rPr>
-        <w:t xml:space="preserve">    sizeNames[0] = "Small"     sizePrice[0] = 3.25</w:t>
-      </w:r>
-      <w:r>
-        <w:br/>
-      </w:r>
-      <w:r>
-        <w:rPr>
-          <w:rStyle w:val="VerbatimChar"/>
-        </w:rPr>
-        <w:t xml:space="preserve">    sizeNames[1] = "Medium"    sizePrice[1] = 5.50</w:t>
-      </w:r>
-      <w:r>
-        <w:br/>
-      </w:r>
-      <w:r>
-        <w:rPr>
-          <w:rStyle w:val="VerbatimChar"/>
-        </w:rPr>
-        <w:t xml:space="preserve">    sizeNames[2] = "Large"     sizePrice[2] = 7.15</w:t>
-      </w:r>
-      <w:r>
-        <w:br/>
-      </w:r>
-      <w:r>
-        <w:rPr>
-          <w:rStyle w:val="VerbatimChar"/>
-        </w:rPr>
-        <w:t xml:space="preserve">    toppingPrice[0] = 0</w:t>
-      </w:r>
-      <w:r>
-        <w:br/>
-      </w:r>
-      <w:r>
-        <w:rPr>
-          <w:rStyle w:val="VerbatimChar"/>
-        </w:rPr>
-        <w:t xml:space="preserve">    toppingPrice[1] = 0.75</w:t>
-      </w:r>
-      <w:r>
-        <w:br/>
-      </w:r>
-      <w:r>
-        <w:rPr>
-          <w:rStyle w:val="VerbatimChar"/>
-        </w:rPr>
-        <w:t xml:space="preserve">    toppingPrice[2] = 1.35</w:t>
-      </w:r>
-      <w:r>
-        <w:br/>
-      </w:r>
-      <w:r>
-        <w:rPr>
-          <w:rStyle w:val="VerbatimChar"/>
-        </w:rPr>
-        <w:t xml:space="preserve">    toppingPrice[3] = 2.00</w:t>
-      </w:r>
-      <w:r>
-        <w:br/>
-      </w:r>
-      <w:r>
-        <w:rPr>
-          <w:rStyle w:val="VerbatimChar"/>
-        </w:rPr>
-        <w:t xml:space="preserve">    toppingPrice[4] = 2.50</w:t>
+        <w:t xml:space="preserve">SUBROUTINE choosePizzas(sizeNames[], sizePrice[], toppingPrice[], noOfPizzas, chosenSize[], chosenToppings[])</w:t>
+      </w:r>
+      <w:r>
+        <w:br/>
+      </w:r>
+      <w:r>
+        <w:rPr>
+          <w:rStyle w:val="VerbatimChar"/>
+        </w:rPr>
+        <w:t xml:space="preserve">    DECLARE Integer counter</w:t>
+      </w:r>
+      <w:r>
+        <w:br/>
+      </w:r>
+      <w:r>
+        <w:rPr>
+          <w:rStyle w:val="VerbatimChar"/>
+        </w:rPr>
+        <w:t xml:space="preserve">    counter = 0</w:t>
+      </w:r>
+      <w:r>
+        <w:br/>
+      </w:r>
+      <w:r>
+        <w:rPr>
+          <w:rStyle w:val="VerbatimChar"/>
+        </w:rPr>
+        <w:t xml:space="preserve">    CALL populateMenu(sizeNames, sizePrice, toppingPrice)</w:t>
+      </w:r>
+      <w:r>
+        <w:br/>
+      </w:r>
+      <w:r>
+        <w:rPr>
+          <w:rStyle w:val="VerbatimChar"/>
+        </w:rPr>
+        <w:t xml:space="preserve">    DO</w:t>
+      </w:r>
+      <w:r>
+        <w:br/>
+      </w:r>
+      <w:r>
+        <w:rPr>
+          <w:rStyle w:val="VerbatimChar"/>
+        </w:rPr>
+        <w:t xml:space="preserve">        CALL displayMenu(sizeNames, sizePrice)</w:t>
+      </w:r>
+      <w:r>
+        <w:br/>
+      </w:r>
+      <w:r>
+        <w:rPr>
+          <w:rStyle w:val="VerbatimChar"/>
+        </w:rPr>
+        <w:t xml:space="preserve">        CALL makeSizeChoice(chosenSize, counter)</w:t>
+      </w:r>
+      <w:r>
+        <w:br/>
+      </w:r>
+      <w:r>
+        <w:rPr>
+          <w:rStyle w:val="VerbatimChar"/>
+        </w:rPr>
+        <w:t xml:space="preserve">        CALL getToppings(chosenToppings, counter)</w:t>
+      </w:r>
+      <w:r>
+        <w:br/>
+      </w:r>
+      <w:r>
+        <w:rPr>
+          <w:rStyle w:val="VerbatimChar"/>
+        </w:rPr>
+        <w:t xml:space="preserve">        counter = counter + 1</w:t>
+      </w:r>
+      <w:r>
+        <w:br/>
+      </w:r>
+      <w:r>
+        <w:rPr>
+          <w:rStyle w:val="VerbatimChar"/>
+        </w:rPr>
+        <w:t xml:space="preserve">    WHILE counter &lt; noOfPizzas</w:t>
       </w:r>
       <w:r>
         <w:br/>
@@ -3868,14 +4184,14 @@
         <w:t xml:space="preserve">END SUBROUTINE</w:t>
       </w:r>
     </w:p>
-    <w:bookmarkEnd w:id="20"/>
-    <w:bookmarkStart w:id="21" w:name="displaymenu"/>
+    <w:bookmarkEnd w:id="25"/>
+    <w:bookmarkStart w:id="26" w:name="populatemenu"/>
     <w:p>
       <w:pPr>
         <w:pStyle w:val="Heading3"/>
       </w:pPr>
       <w:r>
-        <w:t xml:space="preserve">displayMenu</w:t>
+        <w:t xml:space="preserve">populateMenu</w:t>
       </w:r>
     </w:p>
     <w:p>
@@ -3886,61 +4202,79 @@
         <w:rPr>
           <w:rStyle w:val="VerbatimChar"/>
         </w:rPr>
-        <w:t xml:space="preserve">SUBROUTINE displayMenu(sizeNames[], sizePrice[])</w:t>
-      </w:r>
-      <w:r>
-        <w:br/>
-      </w:r>
-      <w:r>
-        <w:rPr>
-          <w:rStyle w:val="VerbatimChar"/>
-        </w:rPr>
-        <w:t xml:space="preserve">    DECLARE Integer loop</w:t>
-      </w:r>
-      <w:r>
-        <w:br/>
-      </w:r>
-      <w:r>
-        <w:rPr>
-          <w:rStyle w:val="VerbatimChar"/>
-        </w:rPr>
-        <w:t xml:space="preserve">    OUTPUT "Pizza Menu:"</w:t>
-      </w:r>
-      <w:r>
-        <w:br/>
-      </w:r>
-      <w:r>
-        <w:rPr>
-          <w:rStyle w:val="VerbatimChar"/>
-        </w:rPr>
-        <w:t xml:space="preserve">    OUTPUT "[id] [Price] [Size]"</w:t>
-      </w:r>
-      <w:r>
-        <w:br/>
-      </w:r>
-      <w:r>
-        <w:rPr>
-          <w:rStyle w:val="VerbatimChar"/>
-        </w:rPr>
-        <w:t xml:space="preserve">    FOR loop = 0 TO 2</w:t>
-      </w:r>
-      <w:r>
-        <w:br/>
-      </w:r>
-      <w:r>
-        <w:rPr>
-          <w:rStyle w:val="VerbatimChar"/>
-        </w:rPr>
-        <w:t xml:space="preserve">        OUTPUT loop &amp; " £" &amp; ToFixed(sizePrice[loop], 2) &amp; " " &amp; sizeNames[loop]</w:t>
-      </w:r>
-      <w:r>
-        <w:br/>
-      </w:r>
-      <w:r>
-        <w:rPr>
-          <w:rStyle w:val="VerbatimChar"/>
-        </w:rPr>
-        <w:t xml:space="preserve">    NEXT loop</w:t>
+        <w:t xml:space="preserve">SUBROUTINE populateMenu(sizeNames[], sizePrice[], toppingPrice[])</w:t>
+      </w:r>
+      <w:r>
+        <w:br/>
+      </w:r>
+      <w:r>
+        <w:rPr>
+          <w:rStyle w:val="VerbatimChar"/>
+        </w:rPr>
+        <w:t xml:space="preserve">    sizeNames[0] = "Small"     sizePrice[0] = 3.25</w:t>
+      </w:r>
+      <w:r>
+        <w:br/>
+      </w:r>
+      <w:r>
+        <w:rPr>
+          <w:rStyle w:val="VerbatimChar"/>
+        </w:rPr>
+        <w:t xml:space="preserve">    sizeNames[1] = "Medium"    sizePrice[1] = 5.50</w:t>
+      </w:r>
+      <w:r>
+        <w:br/>
+      </w:r>
+      <w:r>
+        <w:rPr>
+          <w:rStyle w:val="VerbatimChar"/>
+        </w:rPr>
+        <w:t xml:space="preserve">    sizeNames[2] = "Large"     sizePrice[2] = 7.15</w:t>
+      </w:r>
+      <w:r>
+        <w:br/>
+      </w:r>
+      <w:r>
+        <w:rPr>
+          <w:rStyle w:val="VerbatimChar"/>
+        </w:rPr>
+        <w:t xml:space="preserve">    toppingPrice[0] = 0</w:t>
+      </w:r>
+      <w:r>
+        <w:br/>
+      </w:r>
+      <w:r>
+        <w:rPr>
+          <w:rStyle w:val="VerbatimChar"/>
+        </w:rPr>
+        <w:t xml:space="preserve">    toppingPrice[1] = 0.75</w:t>
+      </w:r>
+      <w:r>
+        <w:br/>
+      </w:r>
+      <w:r>
+        <w:rPr>
+          <w:rStyle w:val="VerbatimChar"/>
+        </w:rPr>
+        <w:t xml:space="preserve">    toppingPrice[2] = 1.35</w:t>
+      </w:r>
+      <w:r>
+        <w:br/>
+      </w:r>
+      <w:r>
+        <w:rPr>
+          <w:rStyle w:val="VerbatimChar"/>
+        </w:rPr>
+        <w:t xml:space="preserve">    toppingPrice[3] = 2.00</w:t>
+      </w:r>
+      <w:r>
+        <w:br/>
+      </w:r>
+      <w:r>
+        <w:rPr>
+          <w:rStyle w:val="VerbatimChar"/>
+        </w:rPr>
+        <w:t xml:space="preserve">    toppingPrice[4] = 2.50</w:t>
       </w:r>
       <w:r>
         <w:br/>
@@ -3952,14 +4286,14 @@
         <w:t xml:space="preserve">END SUBROUTINE</w:t>
       </w:r>
     </w:p>
-    <w:bookmarkEnd w:id="21"/>
-    <w:bookmarkStart w:id="22" w:name="makesizechoice"/>
+    <w:bookmarkEnd w:id="26"/>
+    <w:bookmarkStart w:id="27" w:name="displaymenu"/>
     <w:p>
       <w:pPr>
         <w:pStyle w:val="Heading3"/>
       </w:pPr>
       <w:r>
-        <w:t xml:space="preserve">makeSizeChoice</w:t>
+        <w:t xml:space="preserve">displayMenu</w:t>
       </w:r>
     </w:p>
     <w:p>
@@ -3970,88 +4304,61 @@
         <w:rPr>
           <w:rStyle w:val="VerbatimChar"/>
         </w:rPr>
-        <w:t xml:space="preserve">SUBROUTINE makeSizeChoice(chosenSize[], counter)</w:t>
-      </w:r>
-      <w:r>
-        <w:br/>
-      </w:r>
-      <w:r>
-        <w:rPr>
-          <w:rStyle w:val="VerbatimChar"/>
-        </w:rPr>
-        <w:t xml:space="preserve">    DECLARE Integer choice</w:t>
-      </w:r>
-      <w:r>
-        <w:br/>
-      </w:r>
-      <w:r>
-        <w:rPr>
-          <w:rStyle w:val="VerbatimChar"/>
-        </w:rPr>
-        <w:t xml:space="preserve">    // VALIDATION: size must come from the menu</w:t>
-      </w:r>
-      <w:r>
-        <w:br/>
-      </w:r>
-      <w:r>
-        <w:rPr>
-          <w:rStyle w:val="VerbatimChar"/>
-        </w:rPr>
-        <w:t xml:space="preserve">    OUTPUT "Pizza " &amp; (counter + 1) &amp; ": select size ID:"</w:t>
-      </w:r>
-      <w:r>
-        <w:br/>
-      </w:r>
-      <w:r>
-        <w:rPr>
-          <w:rStyle w:val="VerbatimChar"/>
-        </w:rPr>
-        <w:t xml:space="preserve">    INPUT choice</w:t>
-      </w:r>
-      <w:r>
-        <w:br/>
-      </w:r>
-      <w:r>
-        <w:rPr>
-          <w:rStyle w:val="VerbatimChar"/>
-        </w:rPr>
-        <w:t xml:space="preserve">    WHILE choice &lt; 0 OR choice &gt; 2</w:t>
-      </w:r>
-      <w:r>
-        <w:br/>
-      </w:r>
-      <w:r>
-        <w:rPr>
-          <w:rStyle w:val="VerbatimChar"/>
-        </w:rPr>
-        <w:t xml:space="preserve">        OUTPUT "Invalid choice. Please enter an ID from 0 to 2"</w:t>
-      </w:r>
-      <w:r>
-        <w:br/>
-      </w:r>
-      <w:r>
-        <w:rPr>
-          <w:rStyle w:val="VerbatimChar"/>
-        </w:rPr>
-        <w:t xml:space="preserve">        INPUT choice</w:t>
-      </w:r>
-      <w:r>
-        <w:br/>
-      </w:r>
-      <w:r>
-        <w:rPr>
-          <w:rStyle w:val="VerbatimChar"/>
-        </w:rPr>
-        <w:t xml:space="preserve">    END WHILE</w:t>
-      </w:r>
-      <w:r>
-        <w:br/>
-      </w:r>
-      <w:r>
-        <w:rPr>
-          <w:rStyle w:val="VerbatimChar"/>
-        </w:rPr>
-        <w:t xml:space="preserve">    chosenSize[counter] = choice</w:t>
+        <w:t xml:space="preserve">SUBROUTINE displayMenu(sizeNames[], sizePrice[])</w:t>
+      </w:r>
+      <w:r>
+        <w:br/>
+      </w:r>
+      <w:r>
+        <w:rPr>
+          <w:rStyle w:val="VerbatimChar"/>
+        </w:rPr>
+        <w:t xml:space="preserve">    DECLARE Integer loop</w:t>
+      </w:r>
+      <w:r>
+        <w:br/>
+      </w:r>
+      <w:r>
+        <w:rPr>
+          <w:rStyle w:val="VerbatimChar"/>
+        </w:rPr>
+        <w:t xml:space="preserve">    OUTPUT "Pizza Menu:"</w:t>
+      </w:r>
+      <w:r>
+        <w:br/>
+      </w:r>
+      <w:r>
+        <w:rPr>
+          <w:rStyle w:val="VerbatimChar"/>
+        </w:rPr>
+        <w:t xml:space="preserve">    OUTPUT "[id] [Price] [Size]"</w:t>
+      </w:r>
+      <w:r>
+        <w:br/>
+      </w:r>
+      <w:r>
+        <w:rPr>
+          <w:rStyle w:val="VerbatimChar"/>
+        </w:rPr>
+        <w:t xml:space="preserve">    FOR loop = 0 TO 2</w:t>
+      </w:r>
+      <w:r>
+        <w:br/>
+      </w:r>
+      <w:r>
+        <w:rPr>
+          <w:rStyle w:val="VerbatimChar"/>
+        </w:rPr>
+        <w:t xml:space="preserve">        OUTPUT loop &amp; " £" &amp; ToFixed(sizePrice[loop], 2) &amp; " " &amp; sizeNames[loop]</w:t>
+      </w:r>
+      <w:r>
+        <w:br/>
+      </w:r>
+      <w:r>
+        <w:rPr>
+          <w:rStyle w:val="VerbatimChar"/>
+        </w:rPr>
+        <w:t xml:space="preserve">    NEXT loop</w:t>
       </w:r>
       <w:r>
         <w:br/>
@@ -4063,14 +4370,14 @@
         <w:t xml:space="preserve">END SUBROUTINE</w:t>
       </w:r>
     </w:p>
-    <w:bookmarkEnd w:id="22"/>
-    <w:bookmarkStart w:id="23" w:name="gettoppings"/>
+    <w:bookmarkEnd w:id="27"/>
+    <w:bookmarkStart w:id="28" w:name="makesizechoice"/>
     <w:p>
       <w:pPr>
         <w:pStyle w:val="Heading3"/>
       </w:pPr>
       <w:r>
-        <w:t xml:space="preserve">getToppings</w:t>
+        <w:t xml:space="preserve">makeSizeChoice</w:t>
       </w:r>
     </w:p>
     <w:p>
@@ -4081,70 +4388,70 @@
         <w:rPr>
           <w:rStyle w:val="VerbatimChar"/>
         </w:rPr>
-        <w:t xml:space="preserve">SUBROUTINE getToppings(chosenToppings[], counter)</w:t>
-      </w:r>
-      <w:r>
-        <w:br/>
-      </w:r>
-      <w:r>
-        <w:rPr>
-          <w:rStyle w:val="VerbatimChar"/>
-        </w:rPr>
-        <w:t xml:space="preserve">    DECLARE Integer toppings</w:t>
-      </w:r>
-      <w:r>
-        <w:br/>
-      </w:r>
-      <w:r>
-        <w:rPr>
-          <w:rStyle w:val="VerbatimChar"/>
-        </w:rPr>
-        <w:t xml:space="preserve">    // VALIDATION: toppings cannot be negative</w:t>
-      </w:r>
-      <w:r>
-        <w:br/>
-      </w:r>
-      <w:r>
-        <w:rPr>
-          <w:rStyle w:val="VerbatimChar"/>
-        </w:rPr>
-        <w:t xml:space="preserve">    OUTPUT "Pizza " &amp; (counter + 1) &amp; ": number of extra toppings:"</w:t>
-      </w:r>
-      <w:r>
-        <w:br/>
-      </w:r>
-      <w:r>
-        <w:rPr>
-          <w:rStyle w:val="VerbatimChar"/>
-        </w:rPr>
-        <w:t xml:space="preserve">    INPUT toppings</w:t>
-      </w:r>
-      <w:r>
-        <w:br/>
-      </w:r>
-      <w:r>
-        <w:rPr>
-          <w:rStyle w:val="VerbatimChar"/>
-        </w:rPr>
-        <w:t xml:space="preserve">    WHILE toppings &lt; 0</w:t>
-      </w:r>
-      <w:r>
-        <w:br/>
-      </w:r>
-      <w:r>
-        <w:rPr>
-          <w:rStyle w:val="VerbatimChar"/>
-        </w:rPr>
-        <w:t xml:space="preserve">        OUTPUT "Invalid. Toppings cannot be less than 0"</w:t>
-      </w:r>
-      <w:r>
-        <w:br/>
-      </w:r>
-      <w:r>
-        <w:rPr>
-          <w:rStyle w:val="VerbatimChar"/>
-        </w:rPr>
-        <w:t xml:space="preserve">        INPUT toppings</w:t>
+        <w:t xml:space="preserve">SUBROUTINE makeSizeChoice(chosenSize[], counter)</w:t>
+      </w:r>
+      <w:r>
+        <w:br/>
+      </w:r>
+      <w:r>
+        <w:rPr>
+          <w:rStyle w:val="VerbatimChar"/>
+        </w:rPr>
+        <w:t xml:space="preserve">    DECLARE Integer choice</w:t>
+      </w:r>
+      <w:r>
+        <w:br/>
+      </w:r>
+      <w:r>
+        <w:rPr>
+          <w:rStyle w:val="VerbatimChar"/>
+        </w:rPr>
+        <w:t xml:space="preserve">    // VALIDATION: size must come from the menu</w:t>
+      </w:r>
+      <w:r>
+        <w:br/>
+      </w:r>
+      <w:r>
+        <w:rPr>
+          <w:rStyle w:val="VerbatimChar"/>
+        </w:rPr>
+        <w:t xml:space="preserve">    OUTPUT "Pizza " &amp; (counter + 1) &amp; ": select size ID:"</w:t>
+      </w:r>
+      <w:r>
+        <w:br/>
+      </w:r>
+      <w:r>
+        <w:rPr>
+          <w:rStyle w:val="VerbatimChar"/>
+        </w:rPr>
+        <w:t xml:space="preserve">    INPUT choice</w:t>
+      </w:r>
+      <w:r>
+        <w:br/>
+      </w:r>
+      <w:r>
+        <w:rPr>
+          <w:rStyle w:val="VerbatimChar"/>
+        </w:rPr>
+        <w:t xml:space="preserve">    WHILE choice &lt; 0 OR choice &gt; 2</w:t>
+      </w:r>
+      <w:r>
+        <w:br/>
+      </w:r>
+      <w:r>
+        <w:rPr>
+          <w:rStyle w:val="VerbatimChar"/>
+        </w:rPr>
+        <w:t xml:space="preserve">        OUTPUT "Invalid choice. Please enter an ID from 0 to 2"</w:t>
+      </w:r>
+      <w:r>
+        <w:br/>
+      </w:r>
+      <w:r>
+        <w:rPr>
+          <w:rStyle w:val="VerbatimChar"/>
+        </w:rPr>
+        <w:t xml:space="preserve">        INPUT choice</w:t>
       </w:r>
       <w:r>
         <w:br/>
@@ -4162,7 +4469,7 @@
         <w:rPr>
           <w:rStyle w:val="VerbatimChar"/>
         </w:rPr>
-        <w:t xml:space="preserve">    chosenToppings[counter] = toppings</w:t>
+        <w:t xml:space="preserve">    chosenSize[counter] = choice</w:t>
       </w:r>
       <w:r>
         <w:br/>
@@ -4174,14 +4481,14 @@
         <w:t xml:space="preserve">END SUBROUTINE</w:t>
       </w:r>
     </w:p>
-    <w:bookmarkEnd w:id="23"/>
-    <w:bookmarkStart w:id="24" w:name="getdelivery"/>
+    <w:bookmarkEnd w:id="28"/>
+    <w:bookmarkStart w:id="29" w:name="gettoppings"/>
     <w:p>
       <w:pPr>
         <w:pStyle w:val="Heading3"/>
       </w:pPr>
       <w:r>
-        <w:t xml:space="preserve">getDelivery</w:t>
+        <w:t xml:space="preserve">getToppings</w:t>
       </w:r>
     </w:p>
     <w:p>
@@ -4192,61 +4499,70 @@
         <w:rPr>
           <w:rStyle w:val="VerbatimChar"/>
         </w:rPr>
-        <w:t xml:space="preserve">FUNCTION getDelivery() RETURNS String delivery</w:t>
-      </w:r>
-      <w:r>
-        <w:br/>
-      </w:r>
-      <w:r>
-        <w:rPr>
-          <w:rStyle w:val="VerbatimChar"/>
-        </w:rPr>
-        <w:t xml:space="preserve">    DECLARE String delivery</w:t>
-      </w:r>
-      <w:r>
-        <w:br/>
-      </w:r>
-      <w:r>
-        <w:rPr>
-          <w:rStyle w:val="VerbatimChar"/>
-        </w:rPr>
-        <w:t xml:space="preserve">    OUTPUT "Delivery required? (Y/N):"</w:t>
-      </w:r>
-      <w:r>
-        <w:br/>
-      </w:r>
-      <w:r>
-        <w:rPr>
-          <w:rStyle w:val="VerbatimChar"/>
-        </w:rPr>
-        <w:t xml:space="preserve">    INPUT delivery</w:t>
-      </w:r>
-      <w:r>
-        <w:br/>
-      </w:r>
-      <w:r>
-        <w:rPr>
-          <w:rStyle w:val="VerbatimChar"/>
-        </w:rPr>
-        <w:t xml:space="preserve">    WHILE delivery != "Y" AND delivery != "N"</w:t>
-      </w:r>
-      <w:r>
-        <w:br/>
-      </w:r>
-      <w:r>
-        <w:rPr>
-          <w:rStyle w:val="VerbatimChar"/>
-        </w:rPr>
-        <w:t xml:space="preserve">        OUTPUT "Please enter Y or N"</w:t>
-      </w:r>
-      <w:r>
-        <w:br/>
-      </w:r>
-      <w:r>
-        <w:rPr>
-          <w:rStyle w:val="VerbatimChar"/>
-        </w:rPr>
-        <w:t xml:space="preserve">        INPUT delivery</w:t>
+        <w:t xml:space="preserve">SUBROUTINE getToppings(chosenToppings[], counter)</w:t>
+      </w:r>
+      <w:r>
+        <w:br/>
+      </w:r>
+      <w:r>
+        <w:rPr>
+          <w:rStyle w:val="VerbatimChar"/>
+        </w:rPr>
+        <w:t xml:space="preserve">    DECLARE Integer toppings</w:t>
+      </w:r>
+      <w:r>
+        <w:br/>
+      </w:r>
+      <w:r>
+        <w:rPr>
+          <w:rStyle w:val="VerbatimChar"/>
+        </w:rPr>
+        <w:t xml:space="preserve">    // VALIDATION: toppings cannot be negative</w:t>
+      </w:r>
+      <w:r>
+        <w:br/>
+      </w:r>
+      <w:r>
+        <w:rPr>
+          <w:rStyle w:val="VerbatimChar"/>
+        </w:rPr>
+        <w:t xml:space="preserve">    OUTPUT "Pizza " &amp; (counter + 1) &amp; ": number of extra toppings:"</w:t>
+      </w:r>
+      <w:r>
+        <w:br/>
+      </w:r>
+      <w:r>
+        <w:rPr>
+          <w:rStyle w:val="VerbatimChar"/>
+        </w:rPr>
+        <w:t xml:space="preserve">    INPUT toppings</w:t>
+      </w:r>
+      <w:r>
+        <w:br/>
+      </w:r>
+      <w:r>
+        <w:rPr>
+          <w:rStyle w:val="VerbatimChar"/>
+        </w:rPr>
+        <w:t xml:space="preserve">    WHILE toppings &lt; 0</w:t>
+      </w:r>
+      <w:r>
+        <w:br/>
+      </w:r>
+      <w:r>
+        <w:rPr>
+          <w:rStyle w:val="VerbatimChar"/>
+        </w:rPr>
+        <w:t xml:space="preserve">        OUTPUT "Invalid. Toppings cannot be less than 0"</w:t>
+      </w:r>
+      <w:r>
+        <w:br/>
+      </w:r>
+      <w:r>
+        <w:rPr>
+          <w:rStyle w:val="VerbatimChar"/>
+        </w:rPr>
+        <w:t xml:space="preserve">        INPUT toppings</w:t>
       </w:r>
       <w:r>
         <w:br/>
@@ -4264,26 +4580,26 @@
         <w:rPr>
           <w:rStyle w:val="VerbatimChar"/>
         </w:rPr>
-        <w:t xml:space="preserve">    RETURN delivery</w:t>
-      </w:r>
-      <w:r>
-        <w:br/>
-      </w:r>
-      <w:r>
-        <w:rPr>
-          <w:rStyle w:val="VerbatimChar"/>
-        </w:rPr>
-        <w:t xml:space="preserve">END FUNCTION</w:t>
+        <w:t xml:space="preserve">    chosenToppings[counter] = toppings</w:t>
+      </w:r>
+      <w:r>
+        <w:br/>
+      </w:r>
+      <w:r>
+        <w:rPr>
+          <w:rStyle w:val="VerbatimChar"/>
+        </w:rPr>
+        <w:t xml:space="preserve">END SUBROUTINE</w:t>
       </w:r>
     </w:p>
-    <w:bookmarkEnd w:id="24"/>
-    <w:bookmarkStart w:id="25" w:name="calctotals"/>
+    <w:bookmarkEnd w:id="29"/>
+    <w:bookmarkStart w:id="30" w:name="getdelivery"/>
     <w:p>
       <w:pPr>
         <w:pStyle w:val="Heading3"/>
       </w:pPr>
       <w:r>
-        <w:t xml:space="preserve">calcTotals</w:t>
+        <w:t xml:space="preserve">getDelivery</w:t>
       </w:r>
     </w:p>
     <w:p>
@@ -4294,251 +4610,98 @@
         <w:rPr>
           <w:rStyle w:val="VerbatimChar"/>
         </w:rPr>
-        <w:t xml:space="preserve">SUBROUTINE calcTotals(sizePrice[], toppingPrice[], chosenSize[], chosenToppings[], noOfPizzas, delivery, totals[])</w:t>
-      </w:r>
-      <w:r>
-        <w:br/>
-      </w:r>
-      <w:r>
-        <w:rPr>
-          <w:rStyle w:val="VerbatimChar"/>
-        </w:rPr>
-        <w:t xml:space="preserve">    DECLARE Integer loop</w:t>
-      </w:r>
-      <w:r>
-        <w:br/>
-      </w:r>
-      <w:r>
-        <w:rPr>
-          <w:rStyle w:val="VerbatimChar"/>
-        </w:rPr>
-        <w:t xml:space="preserve">    DECLARE Integer t</w:t>
-      </w:r>
-      <w:r>
-        <w:br/>
-      </w:r>
-      <w:r>
-        <w:rPr>
-          <w:rStyle w:val="VerbatimChar"/>
-        </w:rPr>
-        <w:t xml:space="preserve">    totals[0] = 0</w:t>
-      </w:r>
-      <w:r>
-        <w:br/>
-      </w:r>
-      <w:r>
-        <w:rPr>
-          <w:rStyle w:val="VerbatimChar"/>
-        </w:rPr>
-        <w:t xml:space="preserve">    // Subtotal: size price + topping price for each pizza</w:t>
-      </w:r>
-      <w:r>
-        <w:br/>
-      </w:r>
-      <w:r>
-        <w:rPr>
-          <w:rStyle w:val="VerbatimChar"/>
-        </w:rPr>
-        <w:t xml:space="preserve">    FOR loop = 0 TO noOfPizzas - 1</w:t>
-      </w:r>
-      <w:r>
-        <w:br/>
-      </w:r>
-      <w:r>
-        <w:rPr>
-          <w:rStyle w:val="VerbatimChar"/>
-        </w:rPr>
-        <w:t xml:space="preserve">        t = chosenToppings[loop]</w:t>
-      </w:r>
-      <w:r>
-        <w:br/>
-      </w:r>
-      <w:r>
-        <w:rPr>
-          <w:rStyle w:val="VerbatimChar"/>
-        </w:rPr>
-        <w:t xml:space="preserve">        IF t &gt; 4 THEN</w:t>
-      </w:r>
-      <w:r>
-        <w:br/>
-      </w:r>
-      <w:r>
-        <w:rPr>
-          <w:rStyle w:val="VerbatimChar"/>
-        </w:rPr>
-        <w:t xml:space="preserve">            t = 4</w:t>
-      </w:r>
-      <w:r>
-        <w:br/>
-      </w:r>
-      <w:r>
-        <w:rPr>
-          <w:rStyle w:val="VerbatimChar"/>
-        </w:rPr>
-        <w:t xml:space="preserve">        END IF</w:t>
-      </w:r>
-      <w:r>
-        <w:br/>
-      </w:r>
-      <w:r>
-        <w:rPr>
-          <w:rStyle w:val="VerbatimChar"/>
-        </w:rPr>
-        <w:t xml:space="preserve">        totals[0] = totals[0] + sizePrice[chosenSize[loop]] + toppingPrice[t]</w:t>
-      </w:r>
-      <w:r>
-        <w:br/>
-      </w:r>
-      <w:r>
-        <w:rPr>
-          <w:rStyle w:val="VerbatimChar"/>
-        </w:rPr>
-        <w:t xml:space="preserve">    NEXT loop</w:t>
-      </w:r>
-      <w:r>
-        <w:br/>
-      </w:r>
-      <w:r>
-        <w:rPr>
-          <w:rStyle w:val="VerbatimChar"/>
-        </w:rPr>
-        <w:t xml:space="preserve">    // Discount: 10% if the subtotal is over £20, before delivery</w:t>
-      </w:r>
-      <w:r>
-        <w:br/>
-      </w:r>
-      <w:r>
-        <w:rPr>
-          <w:rStyle w:val="VerbatimChar"/>
-        </w:rPr>
-        <w:t xml:space="preserve">    IF totals[0] &gt; 20 THEN</w:t>
-      </w:r>
-      <w:r>
-        <w:br/>
-      </w:r>
-      <w:r>
-        <w:rPr>
-          <w:rStyle w:val="VerbatimChar"/>
-        </w:rPr>
-        <w:t xml:space="preserve">        totals[1] = totals[0] * 0.10</w:t>
-      </w:r>
-      <w:r>
-        <w:br/>
-      </w:r>
-      <w:r>
-        <w:rPr>
-          <w:rStyle w:val="VerbatimChar"/>
-        </w:rPr>
-        <w:t xml:space="preserve">    ELSE</w:t>
-      </w:r>
-      <w:r>
-        <w:br/>
-      </w:r>
-      <w:r>
-        <w:rPr>
-          <w:rStyle w:val="VerbatimChar"/>
-        </w:rPr>
-        <w:t xml:space="preserve">        totals[1] = 0</w:t>
-      </w:r>
-      <w:r>
-        <w:br/>
-      </w:r>
-      <w:r>
-        <w:rPr>
-          <w:rStyle w:val="VerbatimChar"/>
-        </w:rPr>
-        <w:t xml:space="preserve">    END IF</w:t>
-      </w:r>
-      <w:r>
-        <w:br/>
-      </w:r>
-      <w:r>
-        <w:rPr>
-          <w:rStyle w:val="VerbatimChar"/>
-        </w:rPr>
-        <w:t xml:space="preserve">    // Delivery charge</w:t>
-      </w:r>
-      <w:r>
-        <w:br/>
-      </w:r>
-      <w:r>
-        <w:rPr>
-          <w:rStyle w:val="VerbatimChar"/>
-        </w:rPr>
-        <w:t xml:space="preserve">    IF delivery == "Y" THEN</w:t>
-      </w:r>
-      <w:r>
-        <w:br/>
-      </w:r>
-      <w:r>
-        <w:rPr>
-          <w:rStyle w:val="VerbatimChar"/>
-        </w:rPr>
-        <w:t xml:space="preserve">        totals[2] = 2.50</w:t>
-      </w:r>
-      <w:r>
-        <w:br/>
-      </w:r>
-      <w:r>
-        <w:rPr>
-          <w:rStyle w:val="VerbatimChar"/>
-        </w:rPr>
-        <w:t xml:space="preserve">    ELSE</w:t>
-      </w:r>
-      <w:r>
-        <w:br/>
-      </w:r>
-      <w:r>
-        <w:rPr>
-          <w:rStyle w:val="VerbatimChar"/>
-        </w:rPr>
-        <w:t xml:space="preserve">        totals[2] = 0</w:t>
-      </w:r>
-      <w:r>
-        <w:br/>
-      </w:r>
-      <w:r>
-        <w:rPr>
-          <w:rStyle w:val="VerbatimChar"/>
-        </w:rPr>
-        <w:t xml:space="preserve">    END IF</w:t>
-      </w:r>
-      <w:r>
-        <w:br/>
-      </w:r>
-      <w:r>
-        <w:rPr>
-          <w:rStyle w:val="VerbatimChar"/>
-        </w:rPr>
-        <w:t xml:space="preserve">    // Final total</w:t>
-      </w:r>
-      <w:r>
-        <w:br/>
-      </w:r>
-      <w:r>
-        <w:rPr>
-          <w:rStyle w:val="VerbatimChar"/>
-        </w:rPr>
-        <w:t xml:space="preserve">    totals[3] = totals[0] - totals[1] + totals[2]</w:t>
-      </w:r>
-      <w:r>
-        <w:br/>
-      </w:r>
-      <w:r>
-        <w:rPr>
-          <w:rStyle w:val="VerbatimChar"/>
-        </w:rPr>
-        <w:t xml:space="preserve">END SUBROUTINE</w:t>
+        <w:t xml:space="preserve">FUNCTION getDelivery() RETURNS String delivery</w:t>
+      </w:r>
+      <w:r>
+        <w:br/>
+      </w:r>
+      <w:r>
+        <w:rPr>
+          <w:rStyle w:val="VerbatimChar"/>
+        </w:rPr>
+        <w:t xml:space="preserve">    DECLARE String delivery</w:t>
+      </w:r>
+      <w:r>
+        <w:br/>
+      </w:r>
+      <w:r>
+        <w:rPr>
+          <w:rStyle w:val="VerbatimChar"/>
+        </w:rPr>
+        <w:t xml:space="preserve">    OUTPUT "Delivery required? (Y/N):"</w:t>
+      </w:r>
+      <w:r>
+        <w:br/>
+      </w:r>
+      <w:r>
+        <w:rPr>
+          <w:rStyle w:val="VerbatimChar"/>
+        </w:rPr>
+        <w:t xml:space="preserve">    INPUT delivery</w:t>
+      </w:r>
+      <w:r>
+        <w:br/>
+      </w:r>
+      <w:r>
+        <w:rPr>
+          <w:rStyle w:val="VerbatimChar"/>
+        </w:rPr>
+        <w:t xml:space="preserve">    WHILE delivery != "Y" AND delivery != "N"</w:t>
+      </w:r>
+      <w:r>
+        <w:br/>
+      </w:r>
+      <w:r>
+        <w:rPr>
+          <w:rStyle w:val="VerbatimChar"/>
+        </w:rPr>
+        <w:t xml:space="preserve">        OUTPUT "Please enter Y or N"</w:t>
+      </w:r>
+      <w:r>
+        <w:br/>
+      </w:r>
+      <w:r>
+        <w:rPr>
+          <w:rStyle w:val="VerbatimChar"/>
+        </w:rPr>
+        <w:t xml:space="preserve">        INPUT delivery</w:t>
+      </w:r>
+      <w:r>
+        <w:br/>
+      </w:r>
+      <w:r>
+        <w:rPr>
+          <w:rStyle w:val="VerbatimChar"/>
+        </w:rPr>
+        <w:t xml:space="preserve">    END WHILE</w:t>
+      </w:r>
+      <w:r>
+        <w:br/>
+      </w:r>
+      <w:r>
+        <w:rPr>
+          <w:rStyle w:val="VerbatimChar"/>
+        </w:rPr>
+        <w:t xml:space="preserve">    RETURN delivery</w:t>
+      </w:r>
+      <w:r>
+        <w:br/>
+      </w:r>
+      <w:r>
+        <w:rPr>
+          <w:rStyle w:val="VerbatimChar"/>
+        </w:rPr>
+        <w:t xml:space="preserve">END FUNCTION</w:t>
       </w:r>
     </w:p>
-    <w:bookmarkEnd w:id="25"/>
-    <w:bookmarkStart w:id="26" w:name="displaybill"/>
+    <w:bookmarkEnd w:id="30"/>
+    <w:bookmarkStart w:id="31" w:name="calctotals"/>
     <w:p>
       <w:pPr>
         <w:pStyle w:val="Heading3"/>
       </w:pPr>
       <w:r>
-        <w:t xml:space="preserve">displayBill</w:t>
+        <w:t xml:space="preserve">calcTotals</w:t>
       </w:r>
     </w:p>
     <w:p>
@@ -4549,6 +4712,261 @@
         <w:rPr>
           <w:rStyle w:val="VerbatimChar"/>
         </w:rPr>
+        <w:t xml:space="preserve">SUBROUTINE calcTotals(sizePrice[], toppingPrice[], chosenSize[], chosenToppings[], noOfPizzas, delivery, totals[])</w:t>
+      </w:r>
+      <w:r>
+        <w:br/>
+      </w:r>
+      <w:r>
+        <w:rPr>
+          <w:rStyle w:val="VerbatimChar"/>
+        </w:rPr>
+        <w:t xml:space="preserve">    DECLARE Integer loop</w:t>
+      </w:r>
+      <w:r>
+        <w:br/>
+      </w:r>
+      <w:r>
+        <w:rPr>
+          <w:rStyle w:val="VerbatimChar"/>
+        </w:rPr>
+        <w:t xml:space="preserve">    DECLARE Integer t</w:t>
+      </w:r>
+      <w:r>
+        <w:br/>
+      </w:r>
+      <w:r>
+        <w:rPr>
+          <w:rStyle w:val="VerbatimChar"/>
+        </w:rPr>
+        <w:t xml:space="preserve">    totals[0] = 0</w:t>
+      </w:r>
+      <w:r>
+        <w:br/>
+      </w:r>
+      <w:r>
+        <w:rPr>
+          <w:rStyle w:val="VerbatimChar"/>
+        </w:rPr>
+        <w:t xml:space="preserve">    // Subtotal: size price + topping price for each pizza</w:t>
+      </w:r>
+      <w:r>
+        <w:br/>
+      </w:r>
+      <w:r>
+        <w:rPr>
+          <w:rStyle w:val="VerbatimChar"/>
+        </w:rPr>
+        <w:t xml:space="preserve">    FOR loop = 0 TO noOfPizzas - 1</w:t>
+      </w:r>
+      <w:r>
+        <w:br/>
+      </w:r>
+      <w:r>
+        <w:rPr>
+          <w:rStyle w:val="VerbatimChar"/>
+        </w:rPr>
+        <w:t xml:space="preserve">        t = chosenToppings[loop]</w:t>
+      </w:r>
+      <w:r>
+        <w:br/>
+      </w:r>
+      <w:r>
+        <w:rPr>
+          <w:rStyle w:val="VerbatimChar"/>
+        </w:rPr>
+        <w:t xml:space="preserve">        IF t &gt; 4 THEN</w:t>
+      </w:r>
+      <w:r>
+        <w:br/>
+      </w:r>
+      <w:r>
+        <w:rPr>
+          <w:rStyle w:val="VerbatimChar"/>
+        </w:rPr>
+        <w:t xml:space="preserve">            t = 4</w:t>
+      </w:r>
+      <w:r>
+        <w:br/>
+      </w:r>
+      <w:r>
+        <w:rPr>
+          <w:rStyle w:val="VerbatimChar"/>
+        </w:rPr>
+        <w:t xml:space="preserve">        END IF</w:t>
+      </w:r>
+      <w:r>
+        <w:br/>
+      </w:r>
+      <w:r>
+        <w:rPr>
+          <w:rStyle w:val="VerbatimChar"/>
+        </w:rPr>
+        <w:t xml:space="preserve">        totals[0] = totals[0] + sizePrice[chosenSize[loop]] + toppingPrice[t]</w:t>
+      </w:r>
+      <w:r>
+        <w:br/>
+      </w:r>
+      <w:r>
+        <w:rPr>
+          <w:rStyle w:val="VerbatimChar"/>
+        </w:rPr>
+        <w:t xml:space="preserve">    NEXT loop</w:t>
+      </w:r>
+      <w:r>
+        <w:br/>
+      </w:r>
+      <w:r>
+        <w:rPr>
+          <w:rStyle w:val="VerbatimChar"/>
+        </w:rPr>
+        <w:t xml:space="preserve">    // Discount: 10% if the subtotal is over £20, before delivery</w:t>
+      </w:r>
+      <w:r>
+        <w:br/>
+      </w:r>
+      <w:r>
+        <w:rPr>
+          <w:rStyle w:val="VerbatimChar"/>
+        </w:rPr>
+        <w:t xml:space="preserve">    IF totals[0] &gt; 20 THEN</w:t>
+      </w:r>
+      <w:r>
+        <w:br/>
+      </w:r>
+      <w:r>
+        <w:rPr>
+          <w:rStyle w:val="VerbatimChar"/>
+        </w:rPr>
+        <w:t xml:space="preserve">        totals[1] = totals[0] * 0.10</w:t>
+      </w:r>
+      <w:r>
+        <w:br/>
+      </w:r>
+      <w:r>
+        <w:rPr>
+          <w:rStyle w:val="VerbatimChar"/>
+        </w:rPr>
+        <w:t xml:space="preserve">    ELSE</w:t>
+      </w:r>
+      <w:r>
+        <w:br/>
+      </w:r>
+      <w:r>
+        <w:rPr>
+          <w:rStyle w:val="VerbatimChar"/>
+        </w:rPr>
+        <w:t xml:space="preserve">        totals[1] = 0</w:t>
+      </w:r>
+      <w:r>
+        <w:br/>
+      </w:r>
+      <w:r>
+        <w:rPr>
+          <w:rStyle w:val="VerbatimChar"/>
+        </w:rPr>
+        <w:t xml:space="preserve">    END IF</w:t>
+      </w:r>
+      <w:r>
+        <w:br/>
+      </w:r>
+      <w:r>
+        <w:rPr>
+          <w:rStyle w:val="VerbatimChar"/>
+        </w:rPr>
+        <w:t xml:space="preserve">    // Delivery charge</w:t>
+      </w:r>
+      <w:r>
+        <w:br/>
+      </w:r>
+      <w:r>
+        <w:rPr>
+          <w:rStyle w:val="VerbatimChar"/>
+        </w:rPr>
+        <w:t xml:space="preserve">    IF delivery == "Y" THEN</w:t>
+      </w:r>
+      <w:r>
+        <w:br/>
+      </w:r>
+      <w:r>
+        <w:rPr>
+          <w:rStyle w:val="VerbatimChar"/>
+        </w:rPr>
+        <w:t xml:space="preserve">        totals[2] = 2.50</w:t>
+      </w:r>
+      <w:r>
+        <w:br/>
+      </w:r>
+      <w:r>
+        <w:rPr>
+          <w:rStyle w:val="VerbatimChar"/>
+        </w:rPr>
+        <w:t xml:space="preserve">    ELSE</w:t>
+      </w:r>
+      <w:r>
+        <w:br/>
+      </w:r>
+      <w:r>
+        <w:rPr>
+          <w:rStyle w:val="VerbatimChar"/>
+        </w:rPr>
+        <w:t xml:space="preserve">        totals[2] = 0</w:t>
+      </w:r>
+      <w:r>
+        <w:br/>
+      </w:r>
+      <w:r>
+        <w:rPr>
+          <w:rStyle w:val="VerbatimChar"/>
+        </w:rPr>
+        <w:t xml:space="preserve">    END IF</w:t>
+      </w:r>
+      <w:r>
+        <w:br/>
+      </w:r>
+      <w:r>
+        <w:rPr>
+          <w:rStyle w:val="VerbatimChar"/>
+        </w:rPr>
+        <w:t xml:space="preserve">    // Final total</w:t>
+      </w:r>
+      <w:r>
+        <w:br/>
+      </w:r>
+      <w:r>
+        <w:rPr>
+          <w:rStyle w:val="VerbatimChar"/>
+        </w:rPr>
+        <w:t xml:space="preserve">    totals[3] = totals[0] - totals[1] + totals[2]</w:t>
+      </w:r>
+      <w:r>
+        <w:br/>
+      </w:r>
+      <w:r>
+        <w:rPr>
+          <w:rStyle w:val="VerbatimChar"/>
+        </w:rPr>
+        <w:t xml:space="preserve">END SUBROUTINE</w:t>
+      </w:r>
+    </w:p>
+    <w:bookmarkEnd w:id="31"/>
+    <w:bookmarkStart w:id="32" w:name="displaybill"/>
+    <w:p>
+      <w:pPr>
+        <w:pStyle w:val="Heading3"/>
+      </w:pPr>
+      <w:r>
+        <w:t xml:space="preserve">displayBill</w:t>
+      </w:r>
+    </w:p>
+    <w:p>
+      <w:pPr>
+        <w:pStyle w:val="SourceCode"/>
+      </w:pPr>
+      <w:r>
+        <w:rPr>
+          <w:rStyle w:val="VerbatimChar"/>
+        </w:rPr>
         <w:t xml:space="preserve">SUBROUTINE displayBill(customerDetails[], sizeNames[], sizePrice[], toppingPrice[], chosenSize[], chosenToppings[], noOfPizzas, totals[])</w:t>
       </w:r>
       <w:r>
@@ -4730,9 +5148,9 @@
         </w:pict>
       </w:r>
     </w:p>
-    <w:bookmarkEnd w:id="26"/>
-    <w:bookmarkEnd w:id="27"/>
-    <w:bookmarkStart w:id="28" w:name="assumptions"/>
+    <w:bookmarkEnd w:id="32"/>
+    <w:bookmarkEnd w:id="33"/>
+    <w:bookmarkStart w:id="34" w:name="assumptions"/>
     <w:p>
       <w:pPr>
         <w:pStyle w:val="Heading2"/>
@@ -4862,7 +5280,16 @@
               <w:pStyle w:val="Compact"/>
             </w:pPr>
             <w:r>
-              <w:t xml:space="preserve">No. The brief says "over £20", so £20.00 exactly gets no discount.</w:t>
+              <w:t xml:space="preserve">No. The brief says</w:t>
+            </w:r>
+            <w:r>
+              <w:t xml:space="preserve"> </w:t>
+            </w:r>
+            <w:r>
+              <w:t xml:space="preserve">“over £20”</w:t>
+            </w:r>
+            <w:r>
+              <w:t xml:space="preserve">, so £20.00 exactly gets no discount.</w:t>
             </w:r>
           </w:p>
         </w:tc>
@@ -4947,8 +5374,8 @@
         </w:pict>
       </w:r>
     </w:p>
-    <w:bookmarkEnd w:id="28"/>
-    <w:bookmarkStart w:id="30" w:name="test-plan-design"/>
+    <w:bookmarkEnd w:id="34"/>
+    <w:bookmarkStart w:id="36" w:name="test-plan-design"/>
     <w:p>
       <w:pPr>
         <w:pStyle w:val="Heading2"/>
@@ -4962,7 +5389,7 @@
         <w:pStyle w:val="FirstParagraph"/>
       </w:pPr>
       <w:r>
-        <w:t xml:space="preserve">The expected results were worked out by hand before the build. Nah runs these tests on Sorena's Flowgorithm program and records the actual results.</w:t>
+        <w:t xml:space="preserve">The expected results were worked out by hand before the build. Nah runs these tests on Sorena’s Flowgorithm program and records the actual results.</w:t>
       </w:r>
     </w:p>
     <w:tbl>
@@ -4983,8 +5410,8 @@
       <w:tblGrid>
         <w:gridCol w:w="510"/>
         <w:gridCol w:w="1290"/>
-        <w:gridCol w:w="2590"/>
-        <w:gridCol w:w="2070"/>
+        <w:gridCol w:w="2245"/>
+        <w:gridCol w:w="2314"/>
         <w:gridCol w:w="1500"/>
         <w:gridCol w:w="1500"/>
       </w:tblGrid>
@@ -5224,7 +5651,19 @@
               <w:pStyle w:val="Compact"/>
             </w:pPr>
             <w:r>
-              <w:t xml:space="preserve">Name, address, phone and "Number of pizzas" on the bill</w:t>
+              <w:t xml:space="preserve">Name, address, phone and</w:t>
+            </w:r>
+            <w:r>
+              <w:t xml:space="preserve"> </w:t>
+            </w:r>
+            <w:r>
+              <w:t xml:space="preserve">“Number of pizzas”</w:t>
+            </w:r>
+            <w:r>
+              <w:t xml:space="preserve"> </w:t>
+            </w:r>
+            <w:r>
+              <w:t xml:space="preserve">on the bill</w:t>
             </w:r>
           </w:p>
         </w:tc>
@@ -5410,7 +5849,13 @@
               <w:pStyle w:val="Compact"/>
             </w:pPr>
             <w:r>
-              <w:t xml:space="preserve">"Error, must be between 1 and 6!" and asked again</w:t>
+              <w:t xml:space="preserve">“Error, must be between 1 and 6!”</w:t>
+            </w:r>
+            <w:r>
+              <w:t xml:space="preserve"> </w:t>
+            </w:r>
+            <w:r>
+              <w:t xml:space="preserve">and asked again</w:t>
             </w:r>
           </w:p>
         </w:tc>
@@ -5472,7 +5917,13 @@
               <w:pStyle w:val="Compact"/>
             </w:pPr>
             <w:r>
-              <w:t xml:space="preserve">"Error, must be between 1 and 6!" and asked again</w:t>
+              <w:t xml:space="preserve">“Error, must be between 1 and 6!”</w:t>
+            </w:r>
+            <w:r>
+              <w:t xml:space="preserve"> </w:t>
+            </w:r>
+            <w:r>
+              <w:t xml:space="preserve">and asked again</w:t>
             </w:r>
           </w:p>
         </w:tc>
@@ -5720,7 +6171,13 @@
               <w:pStyle w:val="Compact"/>
             </w:pPr>
             <w:r>
-              <w:t xml:space="preserve">"Invalid choice. Please enter an ID from 0 to 2" and asked again</w:t>
+              <w:t xml:space="preserve">“Invalid choice. Please enter an ID from 0 to 2”</w:t>
+            </w:r>
+            <w:r>
+              <w:t xml:space="preserve"> </w:t>
+            </w:r>
+            <w:r>
+              <w:t xml:space="preserve">and asked again</w:t>
             </w:r>
           </w:p>
         </w:tc>
@@ -5782,7 +6239,13 @@
               <w:pStyle w:val="Compact"/>
             </w:pPr>
             <w:r>
-              <w:t xml:space="preserve">"Invalid choice. Please enter an ID from 0 to 2" and asked again</w:t>
+              <w:t xml:space="preserve">“Invalid choice. Please enter an ID from 0 to 2”</w:t>
+            </w:r>
+            <w:r>
+              <w:t xml:space="preserve"> </w:t>
+            </w:r>
+            <w:r>
+              <w:t xml:space="preserve">and asked again</w:t>
             </w:r>
           </w:p>
         </w:tc>
@@ -5844,7 +6307,13 @@
               <w:pStyle w:val="Compact"/>
             </w:pPr>
             <w:r>
-              <w:t xml:space="preserve">"Invalid. Toppings cannot be less than 0" and asked again</w:t>
+              <w:t xml:space="preserve">“Invalid. Toppings cannot be less than 0”</w:t>
+            </w:r>
+            <w:r>
+              <w:t xml:space="preserve"> </w:t>
+            </w:r>
+            <w:r>
+              <w:t xml:space="preserve">and asked again</w:t>
             </w:r>
           </w:p>
         </w:tc>
@@ -5895,18 +6364,39 @@
               <w:pStyle w:val="Compact"/>
             </w:pPr>
             <w:r>
-              <w:t xml:space="preserve">Delivery "X", then "N"</w:t>
-            </w:r>
-          </w:p>
-        </w:tc>
-        <w:tc>
-          <w:tcPr/>
-          <w:p>
-            <w:pPr>
-              <w:pStyle w:val="Compact"/>
-            </w:pPr>
-            <w:r>
-              <w:t xml:space="preserve">"Please enter Y or N" and asked again</w:t>
+              <w:t xml:space="preserve">Delivery</w:t>
+            </w:r>
+            <w:r>
+              <w:t xml:space="preserve"> </w:t>
+            </w:r>
+            <w:r>
+              <w:t xml:space="preserve">“X”</w:t>
+            </w:r>
+            <w:r>
+              <w:t xml:space="preserve">, then</w:t>
+            </w:r>
+            <w:r>
+              <w:t xml:space="preserve"> </w:t>
+            </w:r>
+            <w:r>
+              <w:t xml:space="preserve">“N”</w:t>
+            </w:r>
+          </w:p>
+        </w:tc>
+        <w:tc>
+          <w:tcPr/>
+          <w:p>
+            <w:pPr>
+              <w:pStyle w:val="Compact"/>
+            </w:pPr>
+            <w:r>
+              <w:t xml:space="preserve">“Please enter Y or N”</w:t>
+            </w:r>
+            <w:r>
+              <w:t xml:space="preserve"> </w:t>
+            </w:r>
+            <w:r>
+              <w:t xml:space="preserve">and asked again</w:t>
             </w:r>
           </w:p>
         </w:tc>
@@ -5968,7 +6458,13 @@
               <w:pStyle w:val="Compact"/>
             </w:pPr>
             <w:r>
-              <w:t xml:space="preserve">"This cannot be blank, try again!" and asked again</w:t>
+              <w:t xml:space="preserve">“This cannot be blank, try again!”</w:t>
+            </w:r>
+            <w:r>
+              <w:t xml:space="preserve"> </w:t>
+            </w:r>
+            <w:r>
+              <w:t xml:space="preserve">and asked again</w:t>
             </w:r>
           </w:p>
         </w:tc>
@@ -6019,7 +6515,13 @@
               <w:pStyle w:val="Compact"/>
             </w:pPr>
             <w:r>
-              <w:t xml:space="preserve">Letters for number of pizzas ("abc"), then 1</w:t>
+              <w:t xml:space="preserve">Letters for number of pizzas (</w:t>
+            </w:r>
+            <w:r>
+              <w:t xml:space="preserve">“abc”</w:t>
+            </w:r>
+            <w:r>
+              <w:t xml:space="preserve">), then 1</w:t>
             </w:r>
           </w:p>
         </w:tc>
@@ -6081,7 +6583,19 @@
               <w:pStyle w:val="Compact"/>
             </w:pPr>
             <w:r>
-              <w:t xml:space="preserve">Lower-case "y" for delivery</w:t>
+              <w:t xml:space="preserve">Lower-case</w:t>
+            </w:r>
+            <w:r>
+              <w:t xml:space="preserve"> </w:t>
+            </w:r>
+            <w:r>
+              <w:t xml:space="preserve">“y”</w:t>
+            </w:r>
+            <w:r>
+              <w:t xml:space="preserve"> </w:t>
+            </w:r>
+            <w:r>
+              <w:t xml:space="preserve">for delivery</w:t>
             </w:r>
           </w:p>
         </w:tc>
@@ -6188,7 +6702,7 @@
         <w:t xml:space="preserve">Nah fills in the last two columns when she runs each test, and adds a screenshot showing the input typed and the output on screen.</w:t>
       </w:r>
     </w:p>
-    <w:bookmarkStart w:id="29" w:name="worked-calculation-test-2"/>
+    <w:bookmarkStart w:id="35" w:name="worked-calculation-test-2"/>
     <w:p>
       <w:pPr>
         <w:pStyle w:val="Heading3"/>
@@ -6202,7 +6716,7 @@
         <w:pStyle w:val="FirstParagraph"/>
       </w:pPr>
       <w:r>
-        <w:t xml:space="preserve">The expected result for Test 2 was worked out by hand before the build. Nah compares the program's answer against it.</w:t>
+        <w:t xml:space="preserve">The expected result for Test 2 was worked out by hand before the build. Nah compares the program’s answer against it.</w:t>
       </w:r>
     </w:p>
     <w:tbl>
@@ -6516,9 +7030,9 @@
         </w:pict>
       </w:r>
     </w:p>
-    <w:bookmarkEnd w:id="29"/>
-    <w:bookmarkEnd w:id="30"/>
-    <w:bookmarkStart w:id="31" w:name="requirements-coverage"/>
+    <w:bookmarkEnd w:id="35"/>
+    <w:bookmarkEnd w:id="36"/>
+    <w:bookmarkStart w:id="37" w:name="requirements-coverage"/>
     <w:p>
       <w:pPr>
         <w:pStyle w:val="Heading2"/>
@@ -7601,8 +8115,8 @@
         </w:tc>
       </w:tr>
     </w:tbl>
-    <w:bookmarkEnd w:id="31"/>
-    <w:bookmarkEnd w:id="32"/>
+    <w:bookmarkEnd w:id="37"/>
+    <w:bookmarkEnd w:id="38"/>
     <w:sectPr>
       <w:footnotePr>
         <w:numRestart w:val="eachSect"/>

</xml_diff>

<commit_message>
Make Marcus's evidence readable: SQL evidence, team SQL page pictures, pizza design
- Marcus_SQL: each screenshot cut down to the query and its result (Readable/),
  full screenshots still linked; new Word and PDF copy with wide results on
  sideways pages.
- Team page: Nah's 3 BuildCores screenshots shown as readable parts-list crops,
  full screenshots still linked. Her originals are unchanged.
- Pizza design: Word copy rebuilt (structure chart on a sideways page, flowchart
  full page, no tables or code split across pages) plus a PDF copy.

Co-Authored-By: Claude Opus 5.5 <noreply@anthropic.com>
</commit_message>
<xml_diff>
--- a/02_Software_Engineering/02_Contributions/Marcus_Design/Design_Pennine_Pizza.docx
+++ b/02_Software_Engineering/02_Contributions/Marcus_Design/Design_Pennine_Pizza.docx
@@ -2,13 +2,28 @@
 <file path=word/document.xml><?xml version="1.0" encoding="utf-8"?>
 <w:document xmlns:w="http://schemas.openxmlformats.org/wordprocessingml/2006/main" xmlns:m="http://schemas.openxmlformats.org/officeDocument/2006/math" xmlns:r="http://schemas.openxmlformats.org/officeDocument/2006/relationships" xmlns:o="urn:schemas-microsoft-com:office:office" xmlns:v="urn:schemas-microsoft-com:vml" xmlns:w10="urn:schemas-microsoft-com:office:word" xmlns:a="http://schemas.openxmlformats.org/drawingml/2006/main" xmlns:pic="http://schemas.openxmlformats.org/drawingml/2006/picture" xmlns:wp="http://schemas.openxmlformats.org/drawingml/2006/wordprocessingDrawing">
   <w:body>
-    <w:bookmarkStart w:id="38" w:name="pennine-pizza-works-design"/>
     <w:p>
       <w:pPr>
-        <w:pStyle w:val="Heading1"/>
+        <w:pStyle w:val="Title"/>
       </w:pPr>
       <w:r>
         <w:t xml:space="preserve">Pennine Pizza Works: Design</w:t>
+      </w:r>
+    </w:p>
+    <w:p>
+      <w:pPr>
+        <w:pStyle w:val="Subtitle"/>
+      </w:pPr>
+      <w:r>
+        <w:t xml:space="preserve">Mini Project 2 · COM4401 Software Engineering Fundamentals</w:t>
+      </w:r>
+    </w:p>
+    <w:p>
+      <w:pPr>
+        <w:pStyle w:val="Author"/>
+      </w:pPr>
+      <w:r>
+        <w:t xml:space="preserve">Marcus Weeks</w:t>
       </w:r>
     </w:p>
     <w:p>
@@ -20,7 +35,13 @@
           <w:b/>
           <w:bCs/>
         </w:rPr>
-        <w:t xml:space="preserve">Mini Project 2 · COM4401 Software Engineering Fundamentals</w:t>
+        <w:t xml:space="preserve">Stage:</w:t>
+      </w:r>
+      <w:r>
+        <w:t xml:space="preserve"> </w:t>
+      </w:r>
+      <w:r>
+        <w:t xml:space="preserve">2. Design (Waterfall life cycle)</w:t>
       </w:r>
     </w:p>
     <w:p>
@@ -32,13 +53,13 @@
           <w:b/>
           <w:bCs/>
         </w:rPr>
-        <w:t xml:space="preserve">Stage:</w:t>
+        <w:t xml:space="preserve">Owner:</w:t>
       </w:r>
       <w:r>
         <w:t xml:space="preserve"> </w:t>
       </w:r>
       <w:r>
-        <w:t xml:space="preserve">2. Design (Waterfall life cycle)</w:t>
+        <w:t xml:space="preserve">Marcus Weeks (Design and test plan design)</w:t>
       </w:r>
     </w:p>
     <w:p>
@@ -50,13 +71,13 @@
           <w:b/>
           <w:bCs/>
         </w:rPr>
-        <w:t xml:space="preserve">Owner:</w:t>
+        <w:t xml:space="preserve">Builds on:</w:t>
       </w:r>
       <w:r>
         <w:t xml:space="preserve"> </w:t>
       </w:r>
       <w:r>
-        <w:t xml:space="preserve">Marcus Weeks (Design and test plan design)</w:t>
+        <w:t xml:space="preserve">Charlie’s Analysis (requirements table and IPO table)</w:t>
       </w:r>
     </w:p>
     <w:p>
@@ -68,51 +89,31 @@
           <w:b/>
           <w:bCs/>
         </w:rPr>
-        <w:t xml:space="preserve">Builds on:</w:t>
+        <w:t xml:space="preserve">Layout follows:</w:t>
       </w:r>
       <w:r>
         <w:t xml:space="preserve"> </w:t>
       </w:r>
       <w:r>
-        <w:t xml:space="preserve">Charlie’s Analysis (requirements table and IPO table)</w:t>
+        <w:t xml:space="preserve">the tutor’s worked example,</w:t>
+      </w:r>
+      <w:r>
+        <w:t xml:space="preserve"> </w:t>
+      </w:r>
+      <w:r>
+        <w:rPr>
+          <w:i/>
+          <w:iCs/>
+        </w:rPr>
+        <w:t xml:space="preserve">Supercar Experience Days: Solution</w:t>
+      </w:r>
+      <w:r>
+        <w:t xml:space="preserve">, Section 2</w:t>
       </w:r>
     </w:p>
     <w:p>
-      <w:pPr>
-        <w:pStyle w:val="BodyText"/>
-      </w:pPr>
-      <w:r>
-        <w:rPr>
-          <w:b/>
-          <w:bCs/>
-        </w:rPr>
-        <w:t xml:space="preserve">Layout follows:</w:t>
-      </w:r>
-      <w:r>
-        <w:t xml:space="preserve"> </w:t>
-      </w:r>
-      <w:r>
-        <w:t xml:space="preserve">the tutor’s worked example,</w:t>
-      </w:r>
-      <w:r>
-        <w:t xml:space="preserve"> </w:t>
-      </w:r>
-      <w:r>
-        <w:rPr>
-          <w:i/>
-          <w:iCs/>
-        </w:rPr>
-        <w:t xml:space="preserve">Supercar Experience Days: Solution</w:t>
-      </w:r>
-      <w:r>
-        <w:t xml:space="preserve">, Section 2</w:t>
-      </w:r>
-    </w:p>
-    <w:p>
-      <w:r>
-        <w:pict>
-          <v:rect style="width:0;height:1.5pt" o:hralign="center" o:hrstd="t" o:hr="t"/>
-        </w:pict>
+      <w:r>
+        <w:br w:type="page"/>
       </w:r>
     </w:p>
     <w:bookmarkStart w:id="9" w:name="requirements-used-in-this-design"/>
@@ -136,21 +137,13 @@
       <w:tblPr>
         <w:tblStyle w:val="Table"/>
         <w:tblW w:type="pct" w:w="5000"/>
-        <w:tblBorders>
-          <w:top w:val="single" w:sz="4" w:space="0" w:color="808080"/>
-          <w:left w:val="single" w:sz="4" w:space="0" w:color="808080"/>
-          <w:bottom w:val="single" w:sz="4" w:space="0" w:color="808080"/>
-          <w:right w:val="single" w:sz="4" w:space="0" w:color="808080"/>
-          <w:insideH w:val="single" w:sz="4" w:space="0" w:color="808080"/>
-          <w:insideV w:val="single" w:sz="4" w:space="0" w:color="808080"/>
-        </w:tblBorders>
         <w:tblLayout w:type="fixed"/>
         <w:tblLook w:firstRow="1" w:lastRow="0" w:firstColumn="0" w:lastColumn="0" w:noHBand="0" w:noVBand="0" w:val="0020"/>
       </w:tblPr>
       <w:tblGrid>
-        <w:gridCol w:w="1076"/>
-        <w:gridCol w:w="7064"/>
-        <w:gridCol w:w="1218"/>
+        <w:gridCol w:w="678"/>
+        <w:gridCol w:w="5883"/>
+        <w:gridCol w:w="1357"/>
       </w:tblGrid>
       <w:tr>
         <w:trPr>
@@ -191,6 +184,9 @@
         </w:tc>
       </w:tr>
       <w:tr>
+        <w:trPr>
+          <w:cantSplit/>
+        </w:trPr>
         <w:tc>
           <w:tcPr/>
           <w:p>
@@ -226,6 +222,9 @@
         </w:tc>
       </w:tr>
       <w:tr>
+        <w:trPr>
+          <w:cantSplit/>
+        </w:trPr>
         <w:tc>
           <w:tcPr/>
           <w:p>
@@ -261,6 +260,9 @@
         </w:tc>
       </w:tr>
       <w:tr>
+        <w:trPr>
+          <w:cantSplit/>
+        </w:trPr>
         <w:tc>
           <w:tcPr/>
           <w:p>
@@ -296,6 +298,9 @@
         </w:tc>
       </w:tr>
       <w:tr>
+        <w:trPr>
+          <w:cantSplit/>
+        </w:trPr>
         <w:tc>
           <w:tcPr/>
           <w:p>
@@ -331,6 +336,9 @@
         </w:tc>
       </w:tr>
       <w:tr>
+        <w:trPr>
+          <w:cantSplit/>
+        </w:trPr>
         <w:tc>
           <w:tcPr/>
           <w:p>
@@ -366,6 +374,9 @@
         </w:tc>
       </w:tr>
       <w:tr>
+        <w:trPr>
+          <w:cantSplit/>
+        </w:trPr>
         <w:tc>
           <w:tcPr/>
           <w:p>
@@ -401,6 +412,9 @@
         </w:tc>
       </w:tr>
       <w:tr>
+        <w:trPr>
+          <w:cantSplit/>
+        </w:trPr>
         <w:tc>
           <w:tcPr/>
           <w:p>
@@ -436,6 +450,9 @@
         </w:tc>
       </w:tr>
       <w:tr>
+        <w:trPr>
+          <w:cantSplit/>
+        </w:trPr>
         <w:tc>
           <w:tcPr/>
           <w:p>
@@ -471,6 +488,9 @@
         </w:tc>
       </w:tr>
       <w:tr>
+        <w:trPr>
+          <w:cantSplit/>
+        </w:trPr>
         <w:tc>
           <w:tcPr/>
           <w:p>
@@ -506,6 +526,9 @@
         </w:tc>
       </w:tr>
       <w:tr>
+        <w:trPr>
+          <w:cantSplit/>
+        </w:trPr>
         <w:tc>
           <w:tcPr/>
           <w:p>
@@ -541,6 +564,9 @@
         </w:tc>
       </w:tr>
       <w:tr>
+        <w:trPr>
+          <w:cantSplit/>
+        </w:trPr>
         <w:tc>
           <w:tcPr/>
           <w:p>
@@ -576,6 +602,9 @@
         </w:tc>
       </w:tr>
       <w:tr>
+        <w:trPr>
+          <w:cantSplit/>
+        </w:trPr>
         <w:tc>
           <w:tcPr/>
           <w:p>
@@ -611,6 +640,9 @@
         </w:tc>
       </w:tr>
       <w:tr>
+        <w:trPr>
+          <w:cantSplit/>
+        </w:trPr>
         <w:tc>
           <w:tcPr/>
           <w:p>
@@ -646,6 +678,9 @@
         </w:tc>
       </w:tr>
       <w:tr>
+        <w:trPr>
+          <w:cantSplit/>
+        </w:trPr>
         <w:tc>
           <w:tcPr/>
           <w:p>
@@ -681,6 +716,9 @@
         </w:tc>
       </w:tr>
       <w:tr>
+        <w:trPr>
+          <w:cantSplit/>
+        </w:trPr>
         <w:tc>
           <w:tcPr/>
           <w:p>
@@ -716,6 +754,9 @@
         </w:tc>
       </w:tr>
       <w:tr>
+        <w:trPr>
+          <w:cantSplit/>
+        </w:trPr>
         <w:tc>
           <w:tcPr/>
           <w:p>
@@ -751,6 +792,9 @@
         </w:tc>
       </w:tr>
       <w:tr>
+        <w:trPr>
+          <w:cantSplit/>
+        </w:trPr>
         <w:tc>
           <w:tcPr/>
           <w:p>
@@ -786,6 +830,9 @@
         </w:tc>
       </w:tr>
       <w:tr>
+        <w:trPr>
+          <w:cantSplit/>
+        </w:trPr>
         <w:tc>
           <w:tcPr/>
           <w:p>
@@ -821,6 +868,9 @@
         </w:tc>
       </w:tr>
       <w:tr>
+        <w:trPr>
+          <w:cantSplit/>
+        </w:trPr>
         <w:tc>
           <w:tcPr/>
           <w:p>
@@ -856,6 +906,9 @@
         </w:tc>
       </w:tr>
       <w:tr>
+        <w:trPr>
+          <w:cantSplit/>
+        </w:trPr>
         <w:tc>
           <w:tcPr/>
           <w:p>
@@ -891,6 +944,9 @@
         </w:tc>
       </w:tr>
       <w:tr>
+        <w:trPr>
+          <w:cantSplit/>
+        </w:trPr>
         <w:tc>
           <w:tcPr/>
           <w:p>
@@ -926,6 +982,9 @@
         </w:tc>
       </w:tr>
       <w:tr>
+        <w:trPr>
+          <w:cantSplit/>
+        </w:trPr>
         <w:tc>
           <w:tcPr/>
           <w:p>
@@ -961,6 +1020,9 @@
         </w:tc>
       </w:tr>
       <w:tr>
+        <w:trPr>
+          <w:cantSplit/>
+        </w:trPr>
         <w:tc>
           <w:tcPr/>
           <w:p>
@@ -996,6 +1058,9 @@
         </w:tc>
       </w:tr>
       <w:tr>
+        <w:trPr>
+          <w:cantSplit/>
+        </w:trPr>
         <w:tc>
           <w:tcPr/>
           <w:p>
@@ -1031,6 +1096,9 @@
         </w:tc>
       </w:tr>
       <w:tr>
+        <w:trPr>
+          <w:cantSplit/>
+        </w:trPr>
         <w:tc>
           <w:tcPr/>
           <w:p>
@@ -1066,6 +1134,9 @@
         </w:tc>
       </w:tr>
       <w:tr>
+        <w:trPr>
+          <w:cantSplit/>
+        </w:trPr>
         <w:tc>
           <w:tcPr/>
           <w:p>
@@ -1101,6 +1172,9 @@
         </w:tc>
       </w:tr>
       <w:tr>
+        <w:trPr>
+          <w:cantSplit/>
+        </w:trPr>
         <w:tc>
           <w:tcPr/>
           <w:p>
@@ -1136,6 +1210,9 @@
         </w:tc>
       </w:tr>
       <w:tr>
+        <w:trPr>
+          <w:cantSplit/>
+        </w:trPr>
         <w:tc>
           <w:tcPr/>
           <w:p>
@@ -1171,6 +1248,9 @@
         </w:tc>
       </w:tr>
       <w:tr>
+        <w:trPr>
+          <w:cantSplit/>
+        </w:trPr>
         <w:tc>
           <w:tcPr/>
           <w:p>
@@ -1208,13 +1288,11 @@
     </w:tbl>
     <w:p>
       <w:r>
-        <w:pict>
-          <v:rect style="width:0;height:1.5pt" o:hralign="center" o:hrstd="t" o:hr="t"/>
-        </w:pict>
+        <w:br w:type="page"/>
       </w:r>
     </w:p>
     <w:bookmarkEnd w:id="9"/>
-    <w:bookmarkStart w:id="13" w:name="X1a902bf427003d794f5f7f89542a7ae5332519f"/>
+    <w:bookmarkStart w:id="13" w:name="decomposition-structure-chart"/>
     <w:p>
       <w:pPr>
         <w:pStyle w:val="Heading2"/>
@@ -1343,14 +1421,22 @@
     </w:p>
     <w:p>
       <w:pPr>
-        <w:pStyle w:val="FirstParagraph"/>
+        <w:sectPr>
+          <w:pgSz w:w="11906" w:h="16838"/>
+          <w:pgMar w:top="1134" w:right="1134" w:bottom="1134" w:left="1134" w:header="708" w:footer="708" w:gutter="0"/>
+        </w:sectPr>
+      </w:pPr>
+    </w:p>
+    <w:p>
+      <w:pPr>
+        <w:pStyle w:val="CaptionedFigure"/>
       </w:pPr>
       <w:r>
         <w:drawing>
           <wp:inline>
-            <wp:extent cx="5334000" cy="2256692"/>
+            <wp:extent cx="9180000" cy="3883845"/>
             <wp:effectExtent b="0" l="0" r="0" t="0"/>
-            <wp:docPr descr="Figure 1: Structure chart" title="" id="11" name="Picture"/>
+            <wp:docPr descr="Figure 1: Structure chart (drawn from page 2 of PenninePizzaDesign.drawio)" title="" id="11" name="Picture"/>
             <a:graphic>
               <a:graphicData uri="http://schemas.openxmlformats.org/drawingml/2006/picture">
                 <pic:pic>
@@ -1369,7 +1455,7 @@
                   <pic:spPr bwMode="auto">
                     <a:xfrm>
                       <a:off x="0" y="0"/>
-                      <a:ext cx="5334000" cy="2256692"/>
+                      <a:ext cx="9180000" cy="3883845"/>
                     </a:xfrm>
                     <a:prstGeom prst="rect">
                       <a:avLst/>
@@ -1390,18 +1476,22 @@
     </w:p>
     <w:p>
       <w:pPr>
-        <w:pStyle w:val="BodyText"/>
+        <w:pStyle w:val="ImageCaption"/>
       </w:pPr>
       <w:r>
-        <w:rPr>
-          <w:i/>
-          <w:iCs/>
-        </w:rPr>
         <w:t xml:space="preserve">Figure 1: Structure chart (drawn from page 2 of PenninePizzaDesign.drawio)</w:t>
       </w:r>
+    </w:p>
+    <w:p>
+      <w:pPr>
+        <w:sectPr>
+          <w:pgSz w:w="16838" w:h="11906" w:orient="landscape"/>
+          <w:pgMar w:top="1134" w:right="1134" w:bottom="1134" w:left="1134" w:header="708" w:footer="708" w:gutter="0"/>
+        </w:sectPr>
+      </w:pPr>
     </w:p>
     <w:bookmarkEnd w:id="13"/>
-    <w:bookmarkStart w:id="17" w:name="Xf405159cf99348bd0581706131149699214828c"/>
+    <w:bookmarkStart w:id="17" w:name="main-flowchart-design"/>
     <w:p>
       <w:pPr>
         <w:pStyle w:val="Heading2"/>
@@ -1422,21 +1512,13 @@
       <w:tblPr>
         <w:tblStyle w:val="Table"/>
         <w:tblW w:type="pct" w:w="5000"/>
-        <w:tblBorders>
-          <w:top w:val="single" w:sz="4" w:space="0" w:color="808080"/>
-          <w:left w:val="single" w:sz="4" w:space="0" w:color="808080"/>
-          <w:bottom w:val="single" w:sz="4" w:space="0" w:color="808080"/>
-          <w:right w:val="single" w:sz="4" w:space="0" w:color="808080"/>
-          <w:insideH w:val="single" w:sz="4" w:space="0" w:color="808080"/>
-          <w:insideV w:val="single" w:sz="4" w:space="0" w:color="808080"/>
-        </w:tblBorders>
         <w:tblLayout w:type="fixed"/>
         <w:tblLook w:firstRow="1" w:lastRow="0" w:firstColumn="0" w:lastColumn="0" w:noHBand="0" w:noVBand="0" w:val="0020"/>
       </w:tblPr>
       <w:tblGrid>
-        <w:gridCol w:w="770"/>
-        <w:gridCol w:w="1160"/>
-        <w:gridCol w:w="7430"/>
+        <w:gridCol w:w="465"/>
+        <w:gridCol w:w="1397"/>
+        <w:gridCol w:w="6056"/>
       </w:tblGrid>
       <w:tr>
         <w:trPr>
@@ -1477,6 +1559,9 @@
         </w:tc>
       </w:tr>
       <w:tr>
+        <w:trPr>
+          <w:cantSplit/>
+        </w:trPr>
         <w:tc>
           <w:tcPr/>
           <w:p>
@@ -1512,6 +1597,9 @@
         </w:tc>
       </w:tr>
       <w:tr>
+        <w:trPr>
+          <w:cantSplit/>
+        </w:trPr>
         <w:tc>
           <w:tcPr/>
           <w:p>
@@ -1553,6 +1641,9 @@
         </w:tc>
       </w:tr>
       <w:tr>
+        <w:trPr>
+          <w:cantSplit/>
+        </w:trPr>
         <w:tc>
           <w:tcPr/>
           <w:p>
@@ -1594,6 +1685,9 @@
         </w:tc>
       </w:tr>
       <w:tr>
+        <w:trPr>
+          <w:cantSplit/>
+        </w:trPr>
         <w:tc>
           <w:tcPr/>
           <w:p>
@@ -1635,6 +1729,9 @@
         </w:tc>
       </w:tr>
       <w:tr>
+        <w:trPr>
+          <w:cantSplit/>
+        </w:trPr>
         <w:tc>
           <w:tcPr/>
           <w:p>
@@ -1676,6 +1773,9 @@
         </w:tc>
       </w:tr>
       <w:tr>
+        <w:trPr>
+          <w:cantSplit/>
+        </w:trPr>
         <w:tc>
           <w:tcPr/>
           <w:p>
@@ -1717,6 +1817,9 @@
         </w:tc>
       </w:tr>
       <w:tr>
+        <w:trPr>
+          <w:cantSplit/>
+        </w:trPr>
         <w:tc>
           <w:tcPr/>
           <w:p>
@@ -1759,15 +1862,20 @@
       </w:tr>
     </w:tbl>
     <w:p>
+      <w:r>
+        <w:br w:type="page"/>
+      </w:r>
+    </w:p>
+    <w:p>
       <w:pPr>
-        <w:pStyle w:val="BodyText"/>
+        <w:pStyle w:val="CaptionedFigure"/>
       </w:pPr>
       <w:r>
         <w:drawing>
           <wp:inline>
-            <wp:extent cx="5334000" cy="5773270"/>
+            <wp:extent cx="6120000" cy="6623999"/>
             <wp:effectExtent b="0" l="0" r="0" t="0"/>
-            <wp:docPr descr="Figure 2: Main flowchart design" title="" id="15" name="Picture"/>
+            <wp:docPr descr="Figure 2: Main flowchart design (drawn from page 1 of PenninePizzaDesign.drawio)" title="" id="15" name="Picture"/>
             <a:graphic>
               <a:graphicData uri="http://schemas.openxmlformats.org/drawingml/2006/picture">
                 <pic:pic>
@@ -1786,7 +1894,7 @@
                   <pic:spPr bwMode="auto">
                     <a:xfrm>
                       <a:off x="0" y="0"/>
-                      <a:ext cx="5334000" cy="5773270"/>
+                      <a:ext cx="6120000" cy="6623999"/>
                     </a:xfrm>
                     <a:prstGeom prst="rect">
                       <a:avLst/>
@@ -1807,18 +1915,19 @@
     </w:p>
     <w:p>
       <w:pPr>
-        <w:pStyle w:val="BodyText"/>
+        <w:pStyle w:val="ImageCaption"/>
       </w:pPr>
       <w:r>
-        <w:rPr>
-          <w:i/>
-          <w:iCs/>
-        </w:rPr>
         <w:t xml:space="preserve">Figure 2: Main flowchart design (drawn from page 1 of PenninePizzaDesign.drawio)</w:t>
+      </w:r>
+    </w:p>
+    <w:p>
+      <w:r>
+        <w:br w:type="page"/>
       </w:r>
     </w:p>
     <w:bookmarkEnd w:id="17"/>
-    <w:bookmarkStart w:id="20" w:name="Xc6f0f334f8618891d3a393afd742b7bb88c8861"/>
+    <w:bookmarkStart w:id="20" w:name="data-plan"/>
     <w:p>
       <w:pPr>
         <w:pStyle w:val="Heading2"/>
@@ -1848,23 +1957,15 @@
       <w:tblPr>
         <w:tblStyle w:val="Table"/>
         <w:tblW w:type="pct" w:w="5000"/>
-        <w:tblBorders>
-          <w:top w:val="single" w:sz="4" w:space="0" w:color="808080"/>
-          <w:left w:val="single" w:sz="4" w:space="0" w:color="808080"/>
-          <w:bottom w:val="single" w:sz="4" w:space="0" w:color="808080"/>
-          <w:right w:val="single" w:sz="4" w:space="0" w:color="808080"/>
-          <w:insideH w:val="single" w:sz="4" w:space="0" w:color="808080"/>
-          <w:insideV w:val="single" w:sz="4" w:space="0" w:color="808080"/>
-        </w:tblBorders>
         <w:tblLayout w:type="fixed"/>
         <w:tblLook w:firstRow="1" w:lastRow="0" w:firstColumn="0" w:lastColumn="0" w:noHBand="0" w:noVBand="0" w:val="0020"/>
       </w:tblPr>
       <w:tblGrid>
-        <w:gridCol w:w="2200"/>
-        <w:gridCol w:w="1160"/>
-        <w:gridCol w:w="770"/>
-        <w:gridCol w:w="2640"/>
-        <w:gridCol w:w="2590"/>
+        <w:gridCol w:w="2233"/>
+        <w:gridCol w:w="1015"/>
+        <w:gridCol w:w="609"/>
+        <w:gridCol w:w="2233"/>
+        <w:gridCol w:w="1827"/>
       </w:tblGrid>
       <w:tr>
         <w:trPr>
@@ -1927,6 +2028,9 @@
         </w:tc>
       </w:tr>
       <w:tr>
+        <w:trPr>
+          <w:cantSplit/>
+        </w:trPr>
         <w:tc>
           <w:tcPr/>
           <w:p>
@@ -1990,6 +2094,9 @@
         </w:tc>
       </w:tr>
       <w:tr>
+        <w:trPr>
+          <w:cantSplit/>
+        </w:trPr>
         <w:tc>
           <w:tcPr/>
           <w:p>
@@ -2053,6 +2160,9 @@
         </w:tc>
       </w:tr>
       <w:tr>
+        <w:trPr>
+          <w:cantSplit/>
+        </w:trPr>
         <w:tc>
           <w:tcPr/>
           <w:p>
@@ -2110,6 +2220,9 @@
         </w:tc>
       </w:tr>
       <w:tr>
+        <w:trPr>
+          <w:cantSplit/>
+        </w:trPr>
         <w:tc>
           <w:tcPr/>
           <w:p>
@@ -2167,6 +2280,9 @@
         </w:tc>
       </w:tr>
       <w:tr>
+        <w:trPr>
+          <w:cantSplit/>
+        </w:trPr>
         <w:tc>
           <w:tcPr/>
           <w:p>
@@ -2224,6 +2340,9 @@
         </w:tc>
       </w:tr>
       <w:tr>
+        <w:trPr>
+          <w:cantSplit/>
+        </w:trPr>
         <w:tc>
           <w:tcPr/>
           <w:p>
@@ -2281,6 +2400,9 @@
         </w:tc>
       </w:tr>
       <w:tr>
+        <w:trPr>
+          <w:cantSplit/>
+        </w:trPr>
         <w:tc>
           <w:tcPr/>
           <w:p>
@@ -2338,6 +2460,9 @@
         </w:tc>
       </w:tr>
       <w:tr>
+        <w:trPr>
+          <w:cantSplit/>
+        </w:trPr>
         <w:tc>
           <w:tcPr/>
           <w:p>
@@ -2378,18 +2503,51 @@
               <w:pStyle w:val="Compact"/>
             </w:pPr>
             <w:r>
-              <w:t xml:space="preserve">The word used in each prompt: “Name”, “Address”, “PhoneNo”. Declared in getCustomerDetails, not Main.</w:t>
-            </w:r>
-          </w:p>
-        </w:tc>
-        <w:tc>
-          <w:tcPr/>
-          <w:p>
-            <w:pPr>
-              <w:pStyle w:val="Compact"/>
-            </w:pPr>
-            <w:r>
-              <w:t xml:space="preserve">label[1] = “Address”</w:t>
+              <w:t xml:space="preserve">The word used in each prompt:</w:t>
+            </w:r>
+            <w:r>
+              <w:t xml:space="preserve"> </w:t>
+            </w:r>
+            <w:r>
+              <w:t xml:space="preserve">“Name”</w:t>
+            </w:r>
+            <w:r>
+              <w:t xml:space="preserve">,</w:t>
+            </w:r>
+            <w:r>
+              <w:t xml:space="preserve"> </w:t>
+            </w:r>
+            <w:r>
+              <w:t xml:space="preserve">“Address”</w:t>
+            </w:r>
+            <w:r>
+              <w:t xml:space="preserve">,</w:t>
+            </w:r>
+            <w:r>
+              <w:t xml:space="preserve"> </w:t>
+            </w:r>
+            <w:r>
+              <w:t xml:space="preserve">“PhoneNo”</w:t>
+            </w:r>
+            <w:r>
+              <w:t xml:space="preserve">. Declared in getCustomerDetails, not Main.</w:t>
+            </w:r>
+          </w:p>
+        </w:tc>
+        <w:tc>
+          <w:tcPr/>
+          <w:p>
+            <w:pPr>
+              <w:pStyle w:val="Compact"/>
+            </w:pPr>
+            <w:r>
+              <w:t xml:space="preserve">label[1] =</w:t>
+            </w:r>
+            <w:r>
+              <w:t xml:space="preserve"> </w:t>
+            </w:r>
+            <w:r>
+              <w:t xml:space="preserve">“Address”</w:t>
             </w:r>
           </w:p>
         </w:tc>
@@ -2424,6 +2582,11 @@
       </w:pPr>
       <w:r>
         <w:t xml:space="preserve">toppingPrice uses the number of toppings as the index. Any number of 4 or more uses index 4, because the brief charges the same £2.50 for 4 or more.</w:t>
+      </w:r>
+    </w:p>
+    <w:p>
+      <w:r>
+        <w:br w:type="page"/>
       </w:r>
     </w:p>
     <w:bookmarkEnd w:id="18"/>
@@ -2440,23 +2603,15 @@
       <w:tblPr>
         <w:tblStyle w:val="Table"/>
         <w:tblW w:type="pct" w:w="5000"/>
-        <w:tblBorders>
-          <w:top w:val="single" w:sz="4" w:space="0" w:color="808080"/>
-          <w:left w:val="single" w:sz="4" w:space="0" w:color="808080"/>
-          <w:bottom w:val="single" w:sz="4" w:space="0" w:color="808080"/>
-          <w:right w:val="single" w:sz="4" w:space="0" w:color="808080"/>
-          <w:insideH w:val="single" w:sz="4" w:space="0" w:color="808080"/>
-          <w:insideV w:val="single" w:sz="4" w:space="0" w:color="808080"/>
-        </w:tblBorders>
         <w:tblLayout w:type="fixed"/>
         <w:tblLook w:firstRow="1" w:lastRow="0" w:firstColumn="0" w:lastColumn="0" w:noHBand="0" w:noVBand="0" w:val="0020"/>
       </w:tblPr>
       <w:tblGrid>
-        <w:gridCol w:w="1550"/>
-        <w:gridCol w:w="1160"/>
-        <w:gridCol w:w="2070"/>
-        <w:gridCol w:w="3030"/>
-        <w:gridCol w:w="1550"/>
+        <w:gridCol w:w="1320"/>
+        <w:gridCol w:w="1100"/>
+        <w:gridCol w:w="1760"/>
+        <w:gridCol w:w="2420"/>
+        <w:gridCol w:w="1320"/>
       </w:tblGrid>
       <w:tr>
         <w:trPr>
@@ -2519,6 +2674,9 @@
         </w:tc>
       </w:tr>
       <w:tr>
+        <w:trPr>
+          <w:cantSplit/>
+        </w:trPr>
         <w:tc>
           <w:tcPr/>
           <w:p>
@@ -2576,6 +2734,9 @@
         </w:tc>
       </w:tr>
       <w:tr>
+        <w:trPr>
+          <w:cantSplit/>
+        </w:trPr>
         <w:tc>
           <w:tcPr/>
           <w:p>
@@ -2645,6 +2806,9 @@
         </w:tc>
       </w:tr>
       <w:tr>
+        <w:trPr>
+          <w:cantSplit/>
+        </w:trPr>
         <w:tc>
           <w:tcPr/>
           <w:p>
@@ -2702,6 +2866,9 @@
         </w:tc>
       </w:tr>
       <w:tr>
+        <w:trPr>
+          <w:cantSplit/>
+        </w:trPr>
         <w:tc>
           <w:tcPr/>
           <w:p>
@@ -2759,6 +2926,9 @@
         </w:tc>
       </w:tr>
       <w:tr>
+        <w:trPr>
+          <w:cantSplit/>
+        </w:trPr>
         <w:tc>
           <w:tcPr/>
           <w:p>
@@ -2816,6 +2986,9 @@
         </w:tc>
       </w:tr>
       <w:tr>
+        <w:trPr>
+          <w:cantSplit/>
+        </w:trPr>
         <w:tc>
           <w:tcPr/>
           <w:p>
@@ -2873,6 +3046,9 @@
         </w:tc>
       </w:tr>
       <w:tr>
+        <w:trPr>
+          <w:cantSplit/>
+        </w:trPr>
         <w:tc>
           <w:tcPr/>
           <w:p>
@@ -2930,9 +3106,14 @@
         </w:tc>
       </w:tr>
     </w:tbl>
+    <w:p>
+      <w:r>
+        <w:br w:type="page"/>
+      </w:r>
+    </w:p>
     <w:bookmarkEnd w:id="19"/>
     <w:bookmarkEnd w:id="20"/>
-    <w:bookmarkStart w:id="21" w:name="Xa5de0fe7fcc46c4a34ab72b0aff7edb614b8ef4"/>
+    <w:bookmarkStart w:id="21" w:name="subroutine-specifications"/>
     <w:p>
       <w:pPr>
         <w:pStyle w:val="Heading2"/>
@@ -2945,22 +3126,14 @@
       <w:tblPr>
         <w:tblStyle w:val="Table"/>
         <w:tblW w:type="pct" w:w="5000"/>
-        <w:tblBorders>
-          <w:top w:val="single" w:sz="4" w:space="0" w:color="808080"/>
-          <w:left w:val="single" w:sz="4" w:space="0" w:color="808080"/>
-          <w:bottom w:val="single" w:sz="4" w:space="0" w:color="808080"/>
-          <w:right w:val="single" w:sz="4" w:space="0" w:color="808080"/>
-          <w:insideH w:val="single" w:sz="4" w:space="0" w:color="808080"/>
-          <w:insideV w:val="single" w:sz="4" w:space="0" w:color="808080"/>
-        </w:tblBorders>
         <w:tblLayout w:type="fixed"/>
         <w:tblLook w:firstRow="1" w:lastRow="0" w:firstColumn="0" w:lastColumn="0" w:noHBand="0" w:noVBand="0" w:val="0020"/>
       </w:tblPr>
       <w:tblGrid>
-        <w:gridCol w:w="2590"/>
-        <w:gridCol w:w="2868"/>
-        <w:gridCol w:w="1160"/>
-        <w:gridCol w:w="2741"/>
+        <w:gridCol w:w="1584"/>
+        <w:gridCol w:w="2376"/>
+        <w:gridCol w:w="1056"/>
+        <w:gridCol w:w="2904"/>
       </w:tblGrid>
       <w:tr>
         <w:trPr>
@@ -3012,6 +3185,9 @@
         </w:tc>
       </w:tr>
       <w:tr>
+        <w:trPr>
+          <w:cantSplit/>
+        </w:trPr>
         <w:tc>
           <w:tcPr/>
           <w:p>
@@ -3058,6 +3234,9 @@
         </w:tc>
       </w:tr>
       <w:tr>
+        <w:trPr>
+          <w:cantSplit/>
+        </w:trPr>
         <w:tc>
           <w:tcPr/>
           <w:p>
@@ -3104,6 +3283,9 @@
         </w:tc>
       </w:tr>
       <w:tr>
+        <w:trPr>
+          <w:cantSplit/>
+        </w:trPr>
         <w:tc>
           <w:tcPr/>
           <w:p>
@@ -3150,6 +3332,9 @@
         </w:tc>
       </w:tr>
       <w:tr>
+        <w:trPr>
+          <w:cantSplit/>
+        </w:trPr>
         <w:tc>
           <w:tcPr/>
           <w:p>
@@ -3196,6 +3381,9 @@
         </w:tc>
       </w:tr>
       <w:tr>
+        <w:trPr>
+          <w:cantSplit/>
+        </w:trPr>
         <w:tc>
           <w:tcPr/>
           <w:p>
@@ -3242,6 +3430,9 @@
         </w:tc>
       </w:tr>
       <w:tr>
+        <w:trPr>
+          <w:cantSplit/>
+        </w:trPr>
         <w:tc>
           <w:tcPr/>
           <w:p>
@@ -3288,6 +3479,9 @@
         </w:tc>
       </w:tr>
       <w:tr>
+        <w:trPr>
+          <w:cantSplit/>
+        </w:trPr>
         <w:tc>
           <w:tcPr/>
           <w:p>
@@ -3334,6 +3528,9 @@
         </w:tc>
       </w:tr>
       <w:tr>
+        <w:trPr>
+          <w:cantSplit/>
+        </w:trPr>
         <w:tc>
           <w:tcPr/>
           <w:p>
@@ -3380,6 +3577,9 @@
         </w:tc>
       </w:tr>
       <w:tr>
+        <w:trPr>
+          <w:cantSplit/>
+        </w:trPr>
         <w:tc>
           <w:tcPr/>
           <w:p>
@@ -3426,6 +3626,9 @@
         </w:tc>
       </w:tr>
       <w:tr>
+        <w:trPr>
+          <w:cantSplit/>
+        </w:trPr>
         <w:tc>
           <w:tcPr/>
           <w:p>
@@ -3472,6 +3675,9 @@
         </w:tc>
       </w:tr>
       <w:tr>
+        <w:trPr>
+          <w:cantSplit/>
+        </w:trPr>
         <w:tc>
           <w:tcPr/>
           <w:p>
@@ -3518,8 +3724,13 @@
         </w:tc>
       </w:tr>
     </w:tbl>
+    <w:p>
+      <w:r>
+        <w:br w:type="page"/>
+      </w:r>
+    </w:p>
     <w:bookmarkEnd w:id="21"/>
-    <w:bookmarkStart w:id="33" w:name="X2645ca7fbf209bdb05f7608772ab1443a8d7ad0"/>
+    <w:bookmarkStart w:id="33" w:name="algorithm-pseudocode"/>
     <w:p>
       <w:pPr>
         <w:pStyle w:val="Heading2"/>
@@ -4370,6 +4581,11 @@
         <w:t xml:space="preserve">END SUBROUTINE</w:t>
       </w:r>
     </w:p>
+    <w:p>
+      <w:r>
+        <w:br w:type="page"/>
+      </w:r>
+    </w:p>
     <w:bookmarkEnd w:id="27"/>
     <w:bookmarkStart w:id="28" w:name="makesizechoice"/>
     <w:p>
@@ -4694,6 +4910,11 @@
         <w:t xml:space="preserve">END FUNCTION</w:t>
       </w:r>
     </w:p>
+    <w:p>
+      <w:r>
+        <w:br w:type="page"/>
+      </w:r>
+    </w:p>
     <w:bookmarkEnd w:id="30"/>
     <w:bookmarkStart w:id="31" w:name="calctotals"/>
     <w:p>
@@ -5139,13 +5360,6 @@
           <w:rStyle w:val="VerbatimChar"/>
         </w:rPr>
         <w:t xml:space="preserve">END SUBROUTINE</w:t>
-      </w:r>
-    </w:p>
-    <w:p>
-      <w:r>
-        <w:pict>
-          <v:rect style="width:0;height:1.5pt" o:hralign="center" o:hrstd="t" o:hr="t"/>
-        </w:pict>
       </w:r>
     </w:p>
     <w:bookmarkEnd w:id="32"/>
@@ -5171,20 +5385,12 @@
       <w:tblPr>
         <w:tblStyle w:val="Table"/>
         <w:tblW w:type="pct" w:w="5000"/>
-        <w:tblBorders>
-          <w:top w:val="single" w:sz="4" w:space="0" w:color="808080"/>
-          <w:left w:val="single" w:sz="4" w:space="0" w:color="808080"/>
-          <w:bottom w:val="single" w:sz="4" w:space="0" w:color="808080"/>
-          <w:right w:val="single" w:sz="4" w:space="0" w:color="808080"/>
-          <w:insideH w:val="single" w:sz="4" w:space="0" w:color="808080"/>
-          <w:insideV w:val="single" w:sz="4" w:space="0" w:color="808080"/>
-        </w:tblBorders>
         <w:tblLayout w:type="fixed"/>
         <w:tblLook w:firstRow="1" w:lastRow="0" w:firstColumn="0" w:lastColumn="0" w:noHBand="0" w:noVBand="0" w:val="0020"/>
       </w:tblPr>
       <w:tblGrid>
-        <w:gridCol w:w="3431"/>
-        <w:gridCol w:w="5928"/>
+        <w:gridCol w:w="3960"/>
+        <w:gridCol w:w="3960"/>
       </w:tblGrid>
       <w:tr>
         <w:trPr>
@@ -5214,6 +5420,9 @@
         </w:tc>
       </w:tr>
       <w:tr>
+        <w:trPr>
+          <w:cantSplit/>
+        </w:trPr>
         <w:tc>
           <w:tcPr/>
           <w:p>
@@ -5238,6 +5447,9 @@
         </w:tc>
       </w:tr>
       <w:tr>
+        <w:trPr>
+          <w:cantSplit/>
+        </w:trPr>
         <w:tc>
           <w:tcPr/>
           <w:p>
@@ -5262,6 +5474,9 @@
         </w:tc>
       </w:tr>
       <w:tr>
+        <w:trPr>
+          <w:cantSplit/>
+        </w:trPr>
         <w:tc>
           <w:tcPr/>
           <w:p>
@@ -5280,7 +5495,7 @@
               <w:pStyle w:val="Compact"/>
             </w:pPr>
             <w:r>
-              <w:t xml:space="preserve">No. The brief says</w:t>
+              <w:t xml:space="preserve">No. The brief says</w:t>
             </w:r>
             <w:r>
               <w:t xml:space="preserve"> </w:t>
@@ -5295,6 +5510,9 @@
         </w:tc>
       </w:tr>
       <w:tr>
+        <w:trPr>
+          <w:cantSplit/>
+        </w:trPr>
         <w:tc>
           <w:tcPr/>
           <w:p>
@@ -5319,6 +5537,9 @@
         </w:tc>
       </w:tr>
       <w:tr>
+        <w:trPr>
+          <w:cantSplit/>
+        </w:trPr>
         <w:tc>
           <w:tcPr/>
           <w:p>
@@ -5343,6 +5564,9 @@
         </w:tc>
       </w:tr>
       <w:tr>
+        <w:trPr>
+          <w:cantSplit/>
+        </w:trPr>
         <w:tc>
           <w:tcPr/>
           <w:p>
@@ -5368,11 +5592,12 @@
       </w:tr>
     </w:tbl>
     <w:p>
-      <w:r>
-        <w:pict>
-          <v:rect style="width:0;height:1.5pt" o:hralign="center" o:hrstd="t" o:hr="t"/>
-        </w:pict>
-      </w:r>
+      <w:pPr>
+        <w:sectPr>
+          <w:pgSz w:w="11906" w:h="16838"/>
+          <w:pgMar w:top="1134" w:right="1134" w:bottom="1134" w:left="1134" w:header="708" w:footer="708" w:gutter="0"/>
+        </w:sectPr>
+      </w:pPr>
     </w:p>
     <w:bookmarkEnd w:id="34"/>
     <w:bookmarkStart w:id="36" w:name="test-plan-design"/>
@@ -5396,24 +5621,16 @@
       <w:tblPr>
         <w:tblStyle w:val="Table"/>
         <w:tblW w:type="pct" w:w="5000"/>
-        <w:tblBorders>
-          <w:top w:val="single" w:sz="4" w:space="0" w:color="808080"/>
-          <w:left w:val="single" w:sz="4" w:space="0" w:color="808080"/>
-          <w:bottom w:val="single" w:sz="4" w:space="0" w:color="808080"/>
-          <w:right w:val="single" w:sz="4" w:space="0" w:color="808080"/>
-          <w:insideH w:val="single" w:sz="4" w:space="0" w:color="808080"/>
-          <w:insideV w:val="single" w:sz="4" w:space="0" w:color="808080"/>
-        </w:tblBorders>
         <w:tblLayout w:type="fixed"/>
         <w:tblLook w:firstRow="1" w:lastRow="0" w:firstColumn="0" w:lastColumn="0" w:noHBand="0" w:noVBand="0" w:val="0020"/>
       </w:tblPr>
       <w:tblGrid>
-        <w:gridCol w:w="510"/>
-        <w:gridCol w:w="1290"/>
-        <w:gridCol w:w="2245"/>
-        <w:gridCol w:w="2314"/>
-        <w:gridCol w:w="1500"/>
-        <w:gridCol w:w="1500"/>
+        <w:gridCol w:w="452"/>
+        <w:gridCol w:w="905"/>
+        <w:gridCol w:w="2036"/>
+        <w:gridCol w:w="2262"/>
+        <w:gridCol w:w="1357"/>
+        <w:gridCol w:w="905"/>
       </w:tblGrid>
       <w:tr>
         <w:trPr>
@@ -5487,6 +5704,9 @@
         </w:tc>
       </w:tr>
       <w:tr>
+        <w:trPr>
+          <w:cantSplit/>
+        </w:trPr>
         <w:tc>
           <w:tcPr/>
           <w:p>
@@ -5549,6 +5769,9 @@
         </w:tc>
       </w:tr>
       <w:tr>
+        <w:trPr>
+          <w:cantSplit/>
+        </w:trPr>
         <w:tc>
           <w:tcPr/>
           <w:p>
@@ -5611,6 +5834,9 @@
         </w:tc>
       </w:tr>
       <w:tr>
+        <w:trPr>
+          <w:cantSplit/>
+        </w:trPr>
         <w:tc>
           <w:tcPr/>
           <w:p>
@@ -5685,6 +5911,9 @@
         </w:tc>
       </w:tr>
       <w:tr>
+        <w:trPr>
+          <w:cantSplit/>
+        </w:trPr>
         <w:tc>
           <w:tcPr/>
           <w:p>
@@ -5747,6 +5976,9 @@
         </w:tc>
       </w:tr>
       <w:tr>
+        <w:trPr>
+          <w:cantSplit/>
+        </w:trPr>
         <w:tc>
           <w:tcPr/>
           <w:p>
@@ -5809,6 +6041,9 @@
         </w:tc>
       </w:tr>
       <w:tr>
+        <w:trPr>
+          <w:cantSplit/>
+        </w:trPr>
         <w:tc>
           <w:tcPr/>
           <w:p>
@@ -5877,6 +6112,9 @@
         </w:tc>
       </w:tr>
       <w:tr>
+        <w:trPr>
+          <w:cantSplit/>
+        </w:trPr>
         <w:tc>
           <w:tcPr/>
           <w:p>
@@ -5945,6 +6183,9 @@
         </w:tc>
       </w:tr>
       <w:tr>
+        <w:trPr>
+          <w:cantSplit/>
+        </w:trPr>
         <w:tc>
           <w:tcPr/>
           <w:p>
@@ -6007,6 +6248,9 @@
         </w:tc>
       </w:tr>
       <w:tr>
+        <w:trPr>
+          <w:cantSplit/>
+        </w:trPr>
         <w:tc>
           <w:tcPr/>
           <w:p>
@@ -6069,6 +6313,9 @@
         </w:tc>
       </w:tr>
       <w:tr>
+        <w:trPr>
+          <w:cantSplit/>
+        </w:trPr>
         <w:tc>
           <w:tcPr/>
           <w:p>
@@ -6131,6 +6378,9 @@
         </w:tc>
       </w:tr>
       <w:tr>
+        <w:trPr>
+          <w:cantSplit/>
+        </w:trPr>
         <w:tc>
           <w:tcPr/>
           <w:p>
@@ -6199,6 +6449,9 @@
         </w:tc>
       </w:tr>
       <w:tr>
+        <w:trPr>
+          <w:cantSplit/>
+        </w:trPr>
         <w:tc>
           <w:tcPr/>
           <w:p>
@@ -6267,6 +6520,9 @@
         </w:tc>
       </w:tr>
       <w:tr>
+        <w:trPr>
+          <w:cantSplit/>
+        </w:trPr>
         <w:tc>
           <w:tcPr/>
           <w:p>
@@ -6335,6 +6591,9 @@
         </w:tc>
       </w:tr>
       <w:tr>
+        <w:trPr>
+          <w:cantSplit/>
+        </w:trPr>
         <w:tc>
           <w:tcPr/>
           <w:p>
@@ -6418,6 +6677,9 @@
         </w:tc>
       </w:tr>
       <w:tr>
+        <w:trPr>
+          <w:cantSplit/>
+        </w:trPr>
         <w:tc>
           <w:tcPr/>
           <w:p>
@@ -6486,6 +6748,9 @@
         </w:tc>
       </w:tr>
       <w:tr>
+        <w:trPr>
+          <w:cantSplit/>
+        </w:trPr>
         <w:tc>
           <w:tcPr/>
           <w:p>
@@ -6554,6 +6819,9 @@
         </w:tc>
       </w:tr>
       <w:tr>
+        <w:trPr>
+          <w:cantSplit/>
+        </w:trPr>
         <w:tc>
           <w:tcPr/>
           <w:p>
@@ -6628,6 +6896,9 @@
         </w:tc>
       </w:tr>
       <w:tr>
+        <w:trPr>
+          <w:cantSplit/>
+        </w:trPr>
         <w:tc>
           <w:tcPr/>
           <w:p>
@@ -6701,6 +6972,14 @@
         </w:rPr>
         <w:t xml:space="preserve">Nah fills in the last two columns when she runs each test, and adds a screenshot showing the input typed and the output on screen.</w:t>
       </w:r>
+    </w:p>
+    <w:p>
+      <w:pPr>
+        <w:sectPr>
+          <w:pgSz w:w="16838" w:h="11906" w:orient="landscape"/>
+          <w:pgMar w:top="1134" w:right="1134" w:bottom="1134" w:left="1134" w:header="708" w:footer="708" w:gutter="0"/>
+        </w:sectPr>
+      </w:pPr>
     </w:p>
     <w:bookmarkStart w:id="35" w:name="worked-calculation-test-2"/>
     <w:p>
@@ -6723,21 +7002,13 @@
       <w:tblPr>
         <w:tblStyle w:val="Table"/>
         <w:tblW w:type="pct" w:w="5000"/>
-        <w:tblBorders>
-          <w:top w:val="single" w:sz="4" w:space="0" w:color="808080"/>
-          <w:left w:val="single" w:sz="4" w:space="0" w:color="808080"/>
-          <w:bottom w:val="single" w:sz="4" w:space="0" w:color="808080"/>
-          <w:right w:val="single" w:sz="4" w:space="0" w:color="808080"/>
-          <w:insideH w:val="single" w:sz="4" w:space="0" w:color="808080"/>
-          <w:insideV w:val="single" w:sz="4" w:space="0" w:color="808080"/>
-        </w:tblBorders>
         <w:tblLayout w:type="fixed"/>
         <w:tblLook w:firstRow="1" w:lastRow="0" w:firstColumn="0" w:lastColumn="0" w:noHBand="0" w:noVBand="0" w:val="0020"/>
       </w:tblPr>
       <w:tblGrid>
-        <w:gridCol w:w="2536"/>
-        <w:gridCol w:w="5721"/>
-        <w:gridCol w:w="1102"/>
+        <w:gridCol w:w="2066"/>
+        <w:gridCol w:w="4132"/>
+        <w:gridCol w:w="1721"/>
       </w:tblGrid>
       <w:tr>
         <w:trPr>
@@ -6778,6 +7049,9 @@
         </w:tc>
       </w:tr>
       <w:tr>
+        <w:trPr>
+          <w:cantSplit/>
+        </w:trPr>
         <w:tc>
           <w:tcPr/>
           <w:p>
@@ -6813,6 +7087,9 @@
         </w:tc>
       </w:tr>
       <w:tr>
+        <w:trPr>
+          <w:cantSplit/>
+        </w:trPr>
         <w:tc>
           <w:tcPr/>
           <w:p>
@@ -6848,6 +7125,9 @@
         </w:tc>
       </w:tr>
       <w:tr>
+        <w:trPr>
+          <w:cantSplit/>
+        </w:trPr>
         <w:tc>
           <w:tcPr/>
           <w:p>
@@ -6883,6 +7163,9 @@
         </w:tc>
       </w:tr>
       <w:tr>
+        <w:trPr>
+          <w:cantSplit/>
+        </w:trPr>
         <w:tc>
           <w:tcPr/>
           <w:p>
@@ -6918,6 +7201,9 @@
         </w:tc>
       </w:tr>
       <w:tr>
+        <w:trPr>
+          <w:cantSplit/>
+        </w:trPr>
         <w:tc>
           <w:tcPr/>
           <w:p>
@@ -6953,6 +7239,9 @@
         </w:tc>
       </w:tr>
       <w:tr>
+        <w:trPr>
+          <w:cantSplit/>
+        </w:trPr>
         <w:tc>
           <w:tcPr/>
           <w:p>
@@ -6988,6 +7277,9 @@
         </w:tc>
       </w:tr>
       <w:tr>
+        <w:trPr>
+          <w:cantSplit/>
+        </w:trPr>
         <w:tc>
           <w:tcPr/>
           <w:p>
@@ -7025,9 +7317,7 @@
     </w:tbl>
     <w:p>
       <w:r>
-        <w:pict>
-          <v:rect style="width:0;height:1.5pt" o:hralign="center" o:hrstd="t" o:hr="t"/>
-        </w:pict>
+        <w:br w:type="page"/>
       </w:r>
     </w:p>
     <w:bookmarkEnd w:id="35"/>
@@ -7045,21 +7335,13 @@
       <w:tblPr>
         <w:tblStyle w:val="Table"/>
         <w:tblW w:type="pct" w:w="5000"/>
-        <w:tblBorders>
-          <w:top w:val="single" w:sz="4" w:space="0" w:color="808080"/>
-          <w:left w:val="single" w:sz="4" w:space="0" w:color="808080"/>
-          <w:bottom w:val="single" w:sz="4" w:space="0" w:color="808080"/>
-          <w:right w:val="single" w:sz="4" w:space="0" w:color="808080"/>
-          <w:insideH w:val="single" w:sz="4" w:space="0" w:color="808080"/>
-          <w:insideV w:val="single" w:sz="4" w:space="0" w:color="808080"/>
-        </w:tblBorders>
         <w:tblLayout w:type="fixed"/>
         <w:tblLook w:firstRow="1" w:lastRow="0" w:firstColumn="0" w:lastColumn="0" w:noHBand="0" w:noVBand="0" w:val="0020"/>
       </w:tblPr>
       <w:tblGrid>
-        <w:gridCol w:w="1193"/>
-        <w:gridCol w:w="5551"/>
-        <w:gridCol w:w="2615"/>
+        <w:gridCol w:w="720"/>
+        <w:gridCol w:w="5040"/>
+        <w:gridCol w:w="2160"/>
       </w:tblGrid>
       <w:tr>
         <w:trPr>
@@ -7100,6 +7382,9 @@
         </w:tc>
       </w:tr>
       <w:tr>
+        <w:trPr>
+          <w:cantSplit/>
+        </w:trPr>
         <w:tc>
           <w:tcPr/>
           <w:p>
@@ -7135,6 +7420,9 @@
         </w:tc>
       </w:tr>
       <w:tr>
+        <w:trPr>
+          <w:cantSplit/>
+        </w:trPr>
         <w:tc>
           <w:tcPr/>
           <w:p>
@@ -7170,6 +7458,9 @@
         </w:tc>
       </w:tr>
       <w:tr>
+        <w:trPr>
+          <w:cantSplit/>
+        </w:trPr>
         <w:tc>
           <w:tcPr/>
           <w:p>
@@ -7205,6 +7496,9 @@
         </w:tc>
       </w:tr>
       <w:tr>
+        <w:trPr>
+          <w:cantSplit/>
+        </w:trPr>
         <w:tc>
           <w:tcPr/>
           <w:p>
@@ -7240,6 +7534,9 @@
         </w:tc>
       </w:tr>
       <w:tr>
+        <w:trPr>
+          <w:cantSplit/>
+        </w:trPr>
         <w:tc>
           <w:tcPr/>
           <w:p>
@@ -7275,6 +7572,9 @@
         </w:tc>
       </w:tr>
       <w:tr>
+        <w:trPr>
+          <w:cantSplit/>
+        </w:trPr>
         <w:tc>
           <w:tcPr/>
           <w:p>
@@ -7310,6 +7610,9 @@
         </w:tc>
       </w:tr>
       <w:tr>
+        <w:trPr>
+          <w:cantSplit/>
+        </w:trPr>
         <w:tc>
           <w:tcPr/>
           <w:p>
@@ -7345,6 +7648,9 @@
         </w:tc>
       </w:tr>
       <w:tr>
+        <w:trPr>
+          <w:cantSplit/>
+        </w:trPr>
         <w:tc>
           <w:tcPr/>
           <w:p>
@@ -7380,6 +7686,9 @@
         </w:tc>
       </w:tr>
       <w:tr>
+        <w:trPr>
+          <w:cantSplit/>
+        </w:trPr>
         <w:tc>
           <w:tcPr/>
           <w:p>
@@ -7415,6 +7724,9 @@
         </w:tc>
       </w:tr>
       <w:tr>
+        <w:trPr>
+          <w:cantSplit/>
+        </w:trPr>
         <w:tc>
           <w:tcPr/>
           <w:p>
@@ -7450,6 +7762,9 @@
         </w:tc>
       </w:tr>
       <w:tr>
+        <w:trPr>
+          <w:cantSplit/>
+        </w:trPr>
         <w:tc>
           <w:tcPr/>
           <w:p>
@@ -7485,6 +7800,9 @@
         </w:tc>
       </w:tr>
       <w:tr>
+        <w:trPr>
+          <w:cantSplit/>
+        </w:trPr>
         <w:tc>
           <w:tcPr/>
           <w:p>
@@ -7520,6 +7838,9 @@
         </w:tc>
       </w:tr>
       <w:tr>
+        <w:trPr>
+          <w:cantSplit/>
+        </w:trPr>
         <w:tc>
           <w:tcPr/>
           <w:p>
@@ -7555,6 +7876,9 @@
         </w:tc>
       </w:tr>
       <w:tr>
+        <w:trPr>
+          <w:cantSplit/>
+        </w:trPr>
         <w:tc>
           <w:tcPr/>
           <w:p>
@@ -7590,6 +7914,9 @@
         </w:tc>
       </w:tr>
       <w:tr>
+        <w:trPr>
+          <w:cantSplit/>
+        </w:trPr>
         <w:tc>
           <w:tcPr/>
           <w:p>
@@ -7625,6 +7952,9 @@
         </w:tc>
       </w:tr>
       <w:tr>
+        <w:trPr>
+          <w:cantSplit/>
+        </w:trPr>
         <w:tc>
           <w:tcPr/>
           <w:p>
@@ -7660,6 +7990,9 @@
         </w:tc>
       </w:tr>
       <w:tr>
+        <w:trPr>
+          <w:cantSplit/>
+        </w:trPr>
         <w:tc>
           <w:tcPr/>
           <w:p>
@@ -7695,6 +8028,9 @@
         </w:tc>
       </w:tr>
       <w:tr>
+        <w:trPr>
+          <w:cantSplit/>
+        </w:trPr>
         <w:tc>
           <w:tcPr/>
           <w:p>
@@ -7730,6 +8066,9 @@
         </w:tc>
       </w:tr>
       <w:tr>
+        <w:trPr>
+          <w:cantSplit/>
+        </w:trPr>
         <w:tc>
           <w:tcPr/>
           <w:p>
@@ -7765,6 +8104,9 @@
         </w:tc>
       </w:tr>
       <w:tr>
+        <w:trPr>
+          <w:cantSplit/>
+        </w:trPr>
         <w:tc>
           <w:tcPr/>
           <w:p>
@@ -7800,6 +8142,9 @@
         </w:tc>
       </w:tr>
       <w:tr>
+        <w:trPr>
+          <w:cantSplit/>
+        </w:trPr>
         <w:tc>
           <w:tcPr/>
           <w:p>
@@ -7835,6 +8180,9 @@
         </w:tc>
       </w:tr>
       <w:tr>
+        <w:trPr>
+          <w:cantSplit/>
+        </w:trPr>
         <w:tc>
           <w:tcPr/>
           <w:p>
@@ -7870,6 +8218,9 @@
         </w:tc>
       </w:tr>
       <w:tr>
+        <w:trPr>
+          <w:cantSplit/>
+        </w:trPr>
         <w:tc>
           <w:tcPr/>
           <w:p>
@@ -7905,6 +8256,9 @@
         </w:tc>
       </w:tr>
       <w:tr>
+        <w:trPr>
+          <w:cantSplit/>
+        </w:trPr>
         <w:tc>
           <w:tcPr/>
           <w:p>
@@ -7940,6 +8294,9 @@
         </w:tc>
       </w:tr>
       <w:tr>
+        <w:trPr>
+          <w:cantSplit/>
+        </w:trPr>
         <w:tc>
           <w:tcPr/>
           <w:p>
@@ -7975,6 +8332,9 @@
         </w:tc>
       </w:tr>
       <w:tr>
+        <w:trPr>
+          <w:cantSplit/>
+        </w:trPr>
         <w:tc>
           <w:tcPr/>
           <w:p>
@@ -8010,6 +8370,9 @@
         </w:tc>
       </w:tr>
       <w:tr>
+        <w:trPr>
+          <w:cantSplit/>
+        </w:trPr>
         <w:tc>
           <w:tcPr/>
           <w:p>
@@ -8045,6 +8408,9 @@
         </w:tc>
       </w:tr>
       <w:tr>
+        <w:trPr>
+          <w:cantSplit/>
+        </w:trPr>
         <w:tc>
           <w:tcPr/>
           <w:p>
@@ -8080,6 +8446,9 @@
         </w:tc>
       </w:tr>
       <w:tr>
+        <w:trPr>
+          <w:cantSplit/>
+        </w:trPr>
         <w:tc>
           <w:tcPr/>
           <w:p>
@@ -8116,7 +8485,6 @@
       </w:tr>
     </w:tbl>
     <w:bookmarkEnd w:id="37"/>
-    <w:bookmarkEnd w:id="38"/>
     <w:sectPr>
       <w:footnotePr>
         <w:numRestart w:val="eachSect"/>

</xml_diff>